<commit_message>
Rewrite 220 oracles in Book-of-Answers humor voice
Replace lecture-like discipline lines with short, deadpan, ambiguous
jokes. Update ritual copy, HTML sample book, A6 print manuscript, and
walkthrough screenshots/video.

Co-authored-by: xuchendu-web <xuchendu-web@users.noreply.github.com>
</commit_message>
<xml_diff>
--- a/docs/股市解答书.docx
+++ b/docs/股市解答书.docx
@@ -29,12 +29,6 @@
               <w:right w:val="nil"/>
             </w:tcBorders>
             <w:vAlign w:val="center"/>
-            <w:tcMar>
-              <w:top w:w="120" w:type="dxa"/>
-              <w:left w:w="160" w:type="dxa"/>
-              <w:bottom w:w="120" w:type="dxa"/>
-              <w:right w:w="160" w:type="dxa"/>
-            </w:tcMar>
           </w:tcPr>
           <w:p>
             <w:pPr>
@@ -97,7 +91,7 @@
                 <w:color w:val="8A7A62"/>
                 <w:sz w:val="20"/>
               </w:rPr>
-              <w:t>给 A 股个人投资者的神谕</w:t>
+              <w:t>一本正经地胡说</w:t>
             </w:r>
           </w:p>
           <w:p>
@@ -113,7 +107,7 @@
                 <w:color w:val="9A7B3C"/>
                 <w:sz w:val="18"/>
               </w:rPr>
-              <w:t>这是启发，不是投资建议。</w:t>
+              <w:t>好玩就好。不是投资建议。</w:t>
             </w:r>
           </w:p>
         </w:tc>
@@ -145,12 +139,6 @@
               <w:right w:val="nil"/>
             </w:tcBorders>
             <w:vAlign w:val="center"/>
-            <w:tcMar>
-              <w:top w:w="120" w:type="dxa"/>
-              <w:left w:w="160" w:type="dxa"/>
-              <w:bottom w:w="120" w:type="dxa"/>
-              <w:right w:w="160" w:type="dxa"/>
-            </w:tcMar>
           </w:tcPr>
           <w:p>
             <w:pPr>
@@ -181,7 +169,7 @@
                 <w:color w:val="2C2416"/>
                 <w:sz w:val="22"/>
               </w:rPr>
-              <w:t>一  只问一个问题。想清楚。</w:t>
+              <w:t>一  想一个问题。一个就好。</w:t>
             </w:r>
           </w:p>
           <w:p>
@@ -197,7 +185,7 @@
                 <w:color w:val="2C2416"/>
                 <w:sz w:val="22"/>
               </w:rPr>
-              <w:t>二  把问题放在心里。</w:t>
+              <w:t>二  不必说出口。</w:t>
             </w:r>
           </w:p>
           <w:p>
@@ -213,7 +201,7 @@
                 <w:color w:val="2C2416"/>
                 <w:sz w:val="22"/>
               </w:rPr>
-              <w:t>三  停一下。吸一口气。</w:t>
+              <w:t>三  闭一下眼。</w:t>
             </w:r>
           </w:p>
           <w:p>
@@ -229,7 +217,7 @@
                 <w:color w:val="2C2416"/>
                 <w:sz w:val="22"/>
               </w:rPr>
-              <w:t>四  翻开一页。只读这一句。</w:t>
+              <w:t>四  翻开。只看这一句。</w:t>
             </w:r>
           </w:p>
           <w:p>
@@ -245,7 +233,7 @@
                 <w:color w:val="2C2416"/>
                 <w:sz w:val="22"/>
               </w:rPr>
-              <w:t>五  自己领会。不要连翻。</w:t>
+              <w:t>五  笑一下也行。领会也行。</w:t>
             </w:r>
           </w:p>
           <w:p>
@@ -261,7 +249,7 @@
                 <w:color w:val="8A7A62"/>
                 <w:sz w:val="20"/>
               </w:rPr>
-              <w:t>与计划冲突时，听计划。</w:t>
+              <w:t>连翻会没意思。</w:t>
             </w:r>
           </w:p>
         </w:tc>
@@ -293,12 +281,6 @@
               <w:right w:val="nil"/>
             </w:tcBorders>
             <w:vAlign w:val="center"/>
-            <w:tcMar>
-              <w:top w:w="120" w:type="dxa"/>
-              <w:left w:w="160" w:type="dxa"/>
-              <w:bottom w:w="120" w:type="dxa"/>
-              <w:right w:w="160" w:type="dxa"/>
-            </w:tcMar>
           </w:tcPr>
           <w:p>
             <w:pPr>
@@ -329,7 +311,7 @@
                 <w:color w:val="2C2416"/>
                 <w:sz w:val="32"/>
               </w:rPr>
-              <w:t>先别动手。</w:t>
+              <w:t>先吃饭。</w:t>
             </w:r>
           </w:p>
           <w:p>
@@ -377,12 +359,6 @@
               <w:right w:val="nil"/>
             </w:tcBorders>
             <w:vAlign w:val="center"/>
-            <w:tcMar>
-              <w:top w:w="120" w:type="dxa"/>
-              <w:left w:w="160" w:type="dxa"/>
-              <w:bottom w:w="120" w:type="dxa"/>
-              <w:right w:w="160" w:type="dxa"/>
-            </w:tcMar>
           </w:tcPr>
           <w:p>
             <w:pPr>
@@ -413,7 +389,7 @@
                 <w:color w:val="2C2416"/>
                 <w:sz w:val="32"/>
               </w:rPr>
-              <w:t>你已经知道了。</w:t>
+              <w:t>你妈知道吗？</w:t>
             </w:r>
           </w:p>
           <w:p>
@@ -461,12 +437,6 @@
               <w:right w:val="nil"/>
             </w:tcBorders>
             <w:vAlign w:val="center"/>
-            <w:tcMar>
-              <w:top w:w="120" w:type="dxa"/>
-              <w:left w:w="160" w:type="dxa"/>
-              <w:bottom w:w="120" w:type="dxa"/>
-              <w:right w:w="160" w:type="dxa"/>
-            </w:tcMar>
           </w:tcPr>
           <w:p>
             <w:pPr>
@@ -497,7 +467,7 @@
                 <w:color w:val="2C2416"/>
                 <w:sz w:val="32"/>
               </w:rPr>
-              <w:t>这不是机会。</w:t>
+              <w:t>这题超纲了。</w:t>
             </w:r>
           </w:p>
           <w:p>
@@ -545,12 +515,6 @@
               <w:right w:val="nil"/>
             </w:tcBorders>
             <w:vAlign w:val="center"/>
-            <w:tcMar>
-              <w:top w:w="120" w:type="dxa"/>
-              <w:left w:w="160" w:type="dxa"/>
-              <w:bottom w:w="120" w:type="dxa"/>
-              <w:right w:w="160" w:type="dxa"/>
-            </w:tcMar>
           </w:tcPr>
           <w:p>
             <w:pPr>
@@ -581,7 +545,7 @@
                 <w:color w:val="2C2416"/>
                 <w:sz w:val="32"/>
               </w:rPr>
-              <w:t>等一等。</w:t>
+              <w:t>风有点大。</w:t>
             </w:r>
           </w:p>
           <w:p>
@@ -629,12 +593,6 @@
               <w:right w:val="nil"/>
             </w:tcBorders>
             <w:vAlign w:val="center"/>
-            <w:tcMar>
-              <w:top w:w="120" w:type="dxa"/>
-              <w:left w:w="160" w:type="dxa"/>
-              <w:bottom w:w="120" w:type="dxa"/>
-              <w:right w:w="160" w:type="dxa"/>
-            </w:tcMar>
           </w:tcPr>
           <w:p>
             <w:pPr>
@@ -665,7 +623,7 @@
                 <w:color w:val="2C2416"/>
                 <w:sz w:val="32"/>
               </w:rPr>
-              <w:t>现在不是时候。</w:t>
+              <w:t>红色。</w:t>
             </w:r>
           </w:p>
           <w:p>
@@ -713,12 +671,6 @@
               <w:right w:val="nil"/>
             </w:tcBorders>
             <w:vAlign w:val="center"/>
-            <w:tcMar>
-              <w:top w:w="120" w:type="dxa"/>
-              <w:left w:w="160" w:type="dxa"/>
-              <w:bottom w:w="120" w:type="dxa"/>
-              <w:right w:w="160" w:type="dxa"/>
-            </w:tcMar>
           </w:tcPr>
           <w:p>
             <w:pPr>
@@ -749,7 +701,7 @@
                 <w:color w:val="2C2416"/>
                 <w:sz w:val="32"/>
               </w:rPr>
-              <w:t>可以。</w:t>
+              <w:t>先系鞋带。</w:t>
             </w:r>
           </w:p>
           <w:p>
@@ -797,12 +749,6 @@
               <w:right w:val="nil"/>
             </w:tcBorders>
             <w:vAlign w:val="center"/>
-            <w:tcMar>
-              <w:top w:w="120" w:type="dxa"/>
-              <w:left w:w="160" w:type="dxa"/>
-              <w:bottom w:w="120" w:type="dxa"/>
-              <w:right w:w="160" w:type="dxa"/>
-            </w:tcMar>
           </w:tcPr>
           <w:p>
             <w:pPr>
@@ -833,7 +779,7 @@
                 <w:color w:val="2C2416"/>
                 <w:sz w:val="32"/>
               </w:rPr>
-              <w:t>不可以。</w:t>
+              <w:t>电梯里别按。</w:t>
             </w:r>
           </w:p>
           <w:p>
@@ -881,12 +827,6 @@
               <w:right w:val="nil"/>
             </w:tcBorders>
             <w:vAlign w:val="center"/>
-            <w:tcMar>
-              <w:top w:w="120" w:type="dxa"/>
-              <w:left w:w="160" w:type="dxa"/>
-              <w:bottom w:w="120" w:type="dxa"/>
-              <w:right w:w="160" w:type="dxa"/>
-            </w:tcMar>
           </w:tcPr>
           <w:p>
             <w:pPr>
@@ -917,7 +857,7 @@
                 <w:color w:val="2C2416"/>
                 <w:sz w:val="32"/>
               </w:rPr>
-              <w:t>是。</w:t>
+              <w:t>它不回微信。</w:t>
             </w:r>
           </w:p>
           <w:p>
@@ -965,12 +905,6 @@
               <w:right w:val="nil"/>
             </w:tcBorders>
             <w:vAlign w:val="center"/>
-            <w:tcMar>
-              <w:top w:w="120" w:type="dxa"/>
-              <w:left w:w="160" w:type="dxa"/>
-              <w:bottom w:w="120" w:type="dxa"/>
-              <w:right w:w="160" w:type="dxa"/>
-            </w:tcMar>
           </w:tcPr>
           <w:p>
             <w:pPr>
@@ -1001,7 +935,7 @@
                 <w:color w:val="2C2416"/>
                 <w:sz w:val="32"/>
               </w:rPr>
-              <w:t>不是。</w:t>
+              <w:t>今天适合喝水。</w:t>
             </w:r>
           </w:p>
           <w:p>
@@ -1049,12 +983,6 @@
               <w:right w:val="nil"/>
             </w:tcBorders>
             <w:vAlign w:val="center"/>
-            <w:tcMar>
-              <w:top w:w="120" w:type="dxa"/>
-              <w:left w:w="160" w:type="dxa"/>
-              <w:bottom w:w="120" w:type="dxa"/>
-              <w:right w:w="160" w:type="dxa"/>
-            </w:tcMar>
           </w:tcPr>
           <w:p>
             <w:pPr>
@@ -1085,7 +1013,7 @@
                 <w:color w:val="2C2416"/>
                 <w:sz w:val="32"/>
               </w:rPr>
-              <w:t>还不是。</w:t>
+              <w:t>群里那条，当没看见。</w:t>
             </w:r>
           </w:p>
           <w:p>
@@ -1133,12 +1061,6 @@
               <w:right w:val="nil"/>
             </w:tcBorders>
             <w:vAlign w:val="center"/>
-            <w:tcMar>
-              <w:top w:w="120" w:type="dxa"/>
-              <w:left w:w="160" w:type="dxa"/>
-              <w:bottom w:w="120" w:type="dxa"/>
-              <w:right w:w="160" w:type="dxa"/>
-            </w:tcMar>
           </w:tcPr>
           <w:p>
             <w:pPr>
@@ -1169,7 +1091,7 @@
                 <w:color w:val="2C2416"/>
                 <w:sz w:val="32"/>
               </w:rPr>
-              <w:t>停手。</w:t>
+              <w:t>可以。别发朋友圈。</w:t>
             </w:r>
           </w:p>
           <w:p>
@@ -1217,12 +1139,6 @@
               <w:right w:val="nil"/>
             </w:tcBorders>
             <w:vAlign w:val="center"/>
-            <w:tcMar>
-              <w:top w:w="120" w:type="dxa"/>
-              <w:left w:w="160" w:type="dxa"/>
-              <w:bottom w:w="120" w:type="dxa"/>
-              <w:right w:w="160" w:type="dxa"/>
-            </w:tcMar>
           </w:tcPr>
           <w:p>
             <w:pPr>
@@ -1253,7 +1169,7 @@
                 <w:color w:val="2C2416"/>
                 <w:sz w:val="32"/>
               </w:rPr>
-              <w:t>让它去。</w:t>
+              <w:t>月亮今晚不管这个。</w:t>
             </w:r>
           </w:p>
           <w:p>
@@ -1301,12 +1217,6 @@
               <w:right w:val="nil"/>
             </w:tcBorders>
             <w:vAlign w:val="center"/>
-            <w:tcMar>
-              <w:top w:w="120" w:type="dxa"/>
-              <w:left w:w="160" w:type="dxa"/>
-              <w:bottom w:w="120" w:type="dxa"/>
-              <w:right w:w="160" w:type="dxa"/>
-            </w:tcMar>
           </w:tcPr>
           <w:p>
             <w:pPr>
@@ -1337,7 +1247,7 @@
                 <w:color w:val="2C2416"/>
                 <w:sz w:val="32"/>
               </w:rPr>
-              <w:t>别加了。</w:t>
+              <w:t>答案在沙发缝里。</w:t>
             </w:r>
           </w:p>
           <w:p>
@@ -1385,12 +1295,6 @@
               <w:right w:val="nil"/>
             </w:tcBorders>
             <w:vAlign w:val="center"/>
-            <w:tcMar>
-              <w:top w:w="120" w:type="dxa"/>
-              <w:left w:w="160" w:type="dxa"/>
-              <w:bottom w:w="120" w:type="dxa"/>
-              <w:right w:w="160" w:type="dxa"/>
-            </w:tcMar>
           </w:tcPr>
           <w:p>
             <w:pPr>
@@ -1421,7 +1325,7 @@
                 <w:color w:val="2C2416"/>
                 <w:sz w:val="32"/>
               </w:rPr>
-              <w:t>别减。</w:t>
+              <w:t>你已经笑了。那就不要。</w:t>
             </w:r>
           </w:p>
           <w:p>
@@ -1469,12 +1373,6 @@
               <w:right w:val="nil"/>
             </w:tcBorders>
             <w:vAlign w:val="center"/>
-            <w:tcMar>
-              <w:top w:w="120" w:type="dxa"/>
-              <w:left w:w="160" w:type="dxa"/>
-              <w:bottom w:w="120" w:type="dxa"/>
-              <w:right w:w="160" w:type="dxa"/>
-            </w:tcMar>
           </w:tcPr>
           <w:p>
             <w:pPr>
@@ -1505,7 +1403,7 @@
                 <w:color w:val="2C2416"/>
                 <w:sz w:val="32"/>
               </w:rPr>
-              <w:t>只看你的计划。</w:t>
+              <w:t>像等外卖一样等。</w:t>
             </w:r>
           </w:p>
           <w:p>
@@ -1553,12 +1451,6 @@
               <w:right w:val="nil"/>
             </w:tcBorders>
             <w:vAlign w:val="center"/>
-            <w:tcMar>
-              <w:top w:w="120" w:type="dxa"/>
-              <w:left w:w="160" w:type="dxa"/>
-              <w:bottom w:w="120" w:type="dxa"/>
-              <w:right w:w="160" w:type="dxa"/>
-            </w:tcMar>
           </w:tcPr>
           <w:p>
             <w:pPr>
@@ -1589,7 +1481,7 @@
                 <w:color w:val="2C2416"/>
                 <w:sz w:val="32"/>
               </w:rPr>
-              <w:t>仓位先降下来。</w:t>
+              <w:t>左手。</w:t>
             </w:r>
           </w:p>
           <w:p>
@@ -1637,12 +1529,6 @@
               <w:right w:val="nil"/>
             </w:tcBorders>
             <w:vAlign w:val="center"/>
-            <w:tcMar>
-              <w:top w:w="120" w:type="dxa"/>
-              <w:left w:w="160" w:type="dxa"/>
-              <w:bottom w:w="120" w:type="dxa"/>
-              <w:right w:w="160" w:type="dxa"/>
-            </w:tcMar>
           </w:tcPr>
           <w:p>
             <w:pPr>
@@ -1673,7 +1559,7 @@
                 <w:color w:val="2C2416"/>
                 <w:sz w:val="32"/>
               </w:rPr>
-              <w:t>现金也是仓位。</w:t>
+              <w:t>这不是你的剧情。</w:t>
             </w:r>
           </w:p>
           <w:p>
@@ -1721,12 +1607,6 @@
               <w:right w:val="nil"/>
             </w:tcBorders>
             <w:vAlign w:val="center"/>
-            <w:tcMar>
-              <w:top w:w="120" w:type="dxa"/>
-              <w:left w:w="160" w:type="dxa"/>
-              <w:bottom w:w="120" w:type="dxa"/>
-              <w:right w:w="160" w:type="dxa"/>
-            </w:tcMar>
           </w:tcPr>
           <w:p>
             <w:pPr>
@@ -1757,7 +1637,7 @@
                 <w:color w:val="2C2416"/>
                 <w:sz w:val="32"/>
               </w:rPr>
-              <w:t>满仓是情绪。</w:t>
+              <w:t>出门右转。</w:t>
             </w:r>
           </w:p>
           <w:p>
@@ -1805,12 +1685,6 @@
               <w:right w:val="nil"/>
             </w:tcBorders>
             <w:vAlign w:val="center"/>
-            <w:tcMar>
-              <w:top w:w="120" w:type="dxa"/>
-              <w:left w:w="160" w:type="dxa"/>
-              <w:bottom w:w="120" w:type="dxa"/>
-              <w:right w:w="160" w:type="dxa"/>
-            </w:tcMar>
           </w:tcPr>
           <w:p>
             <w:pPr>
@@ -1841,7 +1715,7 @@
                 <w:color w:val="2C2416"/>
                 <w:sz w:val="32"/>
               </w:rPr>
-              <w:t>轻一点。</w:t>
+              <w:t>先点赞。不，反过来。</w:t>
             </w:r>
           </w:p>
           <w:p>
@@ -1889,12 +1763,6 @@
               <w:right w:val="nil"/>
             </w:tcBorders>
             <w:vAlign w:val="center"/>
-            <w:tcMar>
-              <w:top w:w="120" w:type="dxa"/>
-              <w:left w:w="160" w:type="dxa"/>
-              <w:bottom w:w="120" w:type="dxa"/>
-              <w:right w:w="160" w:type="dxa"/>
-            </w:tcMar>
           </w:tcPr>
           <w:p>
             <w:pPr>
@@ -1925,7 +1793,7 @@
                 <w:color w:val="2C2416"/>
                 <w:sz w:val="32"/>
               </w:rPr>
-              <w:t>重仓要配得起睡眠。</w:t>
+              <w:t>宇宙说：嗯。</w:t>
             </w:r>
           </w:p>
           <w:p>
@@ -1973,12 +1841,6 @@
               <w:right w:val="nil"/>
             </w:tcBorders>
             <w:vAlign w:val="center"/>
-            <w:tcMar>
-              <w:top w:w="120" w:type="dxa"/>
-              <w:left w:w="160" w:type="dxa"/>
-              <w:bottom w:w="120" w:type="dxa"/>
-              <w:right w:w="160" w:type="dxa"/>
-            </w:tcMar>
           </w:tcPr>
           <w:p>
             <w:pPr>
@@ -2009,7 +1871,7 @@
                 <w:color w:val="2C2416"/>
                 <w:sz w:val="32"/>
               </w:rPr>
-              <w:t>三分之一就够。</w:t>
+              <w:t>涨停板今天没空。</w:t>
             </w:r>
           </w:p>
           <w:p>
@@ -2057,12 +1919,6 @@
               <w:right w:val="nil"/>
             </w:tcBorders>
             <w:vAlign w:val="center"/>
-            <w:tcMar>
-              <w:top w:w="120" w:type="dxa"/>
-              <w:left w:w="160" w:type="dxa"/>
-              <w:bottom w:w="120" w:type="dxa"/>
-              <w:right w:w="160" w:type="dxa"/>
-            </w:tcMar>
           </w:tcPr>
           <w:p>
             <w:pPr>
@@ -2093,7 +1949,7 @@
                 <w:color w:val="2C2416"/>
                 <w:sz w:val="32"/>
               </w:rPr>
-              <w:t>这一笔，不要。</w:t>
+              <w:t>把问题放进冰箱。</w:t>
             </w:r>
           </w:p>
           <w:p>
@@ -2141,12 +1997,6 @@
               <w:right w:val="nil"/>
             </w:tcBorders>
             <w:vAlign w:val="center"/>
-            <w:tcMar>
-              <w:top w:w="120" w:type="dxa"/>
-              <w:left w:w="160" w:type="dxa"/>
-              <w:bottom w:w="120" w:type="dxa"/>
-              <w:right w:w="160" w:type="dxa"/>
-            </w:tcMar>
           </w:tcPr>
           <w:p>
             <w:pPr>
@@ -2177,7 +2027,7 @@
                 <w:color w:val="2C2416"/>
                 <w:sz w:val="32"/>
               </w:rPr>
-              <w:t>这一笔，值得。</w:t>
+              <w:t>遥控器不在你手里。</w:t>
             </w:r>
           </w:p>
           <w:p>
@@ -2225,12 +2075,6 @@
               <w:right w:val="nil"/>
             </w:tcBorders>
             <w:vAlign w:val="center"/>
-            <w:tcMar>
-              <w:top w:w="120" w:type="dxa"/>
-              <w:left w:w="160" w:type="dxa"/>
-              <w:bottom w:w="120" w:type="dxa"/>
-              <w:right w:w="160" w:type="dxa"/>
-            </w:tcMar>
           </w:tcPr>
           <w:p>
             <w:pPr>
@@ -2261,7 +2105,7 @@
                 <w:color w:val="2C2416"/>
                 <w:sz w:val="32"/>
               </w:rPr>
-              <w:t>不要为了交易而交易。</w:t>
+              <w:t>问过椅子了吗？</w:t>
             </w:r>
           </w:p>
           <w:p>
@@ -2309,12 +2153,6 @@
               <w:right w:val="nil"/>
             </w:tcBorders>
             <w:vAlign w:val="center"/>
-            <w:tcMar>
-              <w:top w:w="120" w:type="dxa"/>
-              <w:left w:w="160" w:type="dxa"/>
-              <w:bottom w:w="120" w:type="dxa"/>
-              <w:right w:w="160" w:type="dxa"/>
-            </w:tcMar>
           </w:tcPr>
           <w:p>
             <w:pPr>
@@ -2345,7 +2183,7 @@
                 <w:color w:val="2C2416"/>
                 <w:sz w:val="32"/>
               </w:rPr>
-              <w:t>今天没有必须做的事。</w:t>
+              <w:t>绿灯也不一定过。</w:t>
             </w:r>
           </w:p>
           <w:p>
@@ -2393,12 +2231,6 @@
               <w:right w:val="nil"/>
             </w:tcBorders>
             <w:vAlign w:val="center"/>
-            <w:tcMar>
-              <w:top w:w="120" w:type="dxa"/>
-              <w:left w:w="160" w:type="dxa"/>
-              <w:bottom w:w="120" w:type="dxa"/>
-              <w:right w:w="160" w:type="dxa"/>
-            </w:tcMar>
           </w:tcPr>
           <w:p>
             <w:pPr>
@@ -2429,7 +2261,7 @@
                 <w:color w:val="2C2416"/>
                 <w:sz w:val="32"/>
               </w:rPr>
-              <w:t>把手指离开键盘。</w:t>
+              <w:t>它比你困。</w:t>
             </w:r>
           </w:p>
           <w:p>
@@ -2477,12 +2309,6 @@
               <w:right w:val="nil"/>
             </w:tcBorders>
             <w:vAlign w:val="center"/>
-            <w:tcMar>
-              <w:top w:w="120" w:type="dxa"/>
-              <w:left w:w="160" w:type="dxa"/>
-              <w:bottom w:w="120" w:type="dxa"/>
-              <w:right w:w="160" w:type="dxa"/>
-            </w:tcMar>
           </w:tcPr>
           <w:p>
             <w:pPr>
@@ -2513,7 +2339,7 @@
                 <w:color w:val="2C2416"/>
                 <w:sz w:val="32"/>
               </w:rPr>
-              <w:t>离场是一种能力。</w:t>
+              <w:t>这锅，不背。</w:t>
             </w:r>
           </w:p>
           <w:p>
@@ -2561,12 +2387,6 @@
               <w:right w:val="nil"/>
             </w:tcBorders>
             <w:vAlign w:val="center"/>
-            <w:tcMar>
-              <w:top w:w="120" w:type="dxa"/>
-              <w:left w:w="160" w:type="dxa"/>
-              <w:bottom w:w="120" w:type="dxa"/>
-              <w:right w:w="160" w:type="dxa"/>
-            </w:tcMar>
           </w:tcPr>
           <w:p>
             <w:pPr>
@@ -2597,7 +2417,7 @@
                 <w:color w:val="2C2416"/>
                 <w:sz w:val="32"/>
               </w:rPr>
-              <w:t>留下，是另一种。</w:t>
+              <w:t>北向资金没加你微信。</w:t>
             </w:r>
           </w:p>
           <w:p>
@@ -2645,12 +2465,6 @@
               <w:right w:val="nil"/>
             </w:tcBorders>
             <w:vAlign w:val="center"/>
-            <w:tcMar>
-              <w:top w:w="120" w:type="dxa"/>
-              <w:left w:w="160" w:type="dxa"/>
-              <w:bottom w:w="120" w:type="dxa"/>
-              <w:right w:w="160" w:type="dxa"/>
-            </w:tcMar>
           </w:tcPr>
           <w:p>
             <w:pPr>
@@ -2681,7 +2495,7 @@
                 <w:color w:val="2C2416"/>
                 <w:sz w:val="32"/>
               </w:rPr>
-              <w:t>你在证明自己，不是在投资。</w:t>
+              <w:t>再问一遍，小声点。</w:t>
             </w:r>
           </w:p>
           <w:p>
@@ -2729,12 +2543,6 @@
               <w:right w:val="nil"/>
             </w:tcBorders>
             <w:vAlign w:val="center"/>
-            <w:tcMar>
-              <w:top w:w="120" w:type="dxa"/>
-              <w:left w:w="160" w:type="dxa"/>
-              <w:bottom w:w="120" w:type="dxa"/>
-              <w:right w:w="160" w:type="dxa"/>
-            </w:tcMar>
           </w:tcPr>
           <w:p>
             <w:pPr>
@@ -2765,7 +2573,7 @@
                 <w:color w:val="2C2416"/>
                 <w:sz w:val="32"/>
               </w:rPr>
-              <w:t>别把希望当策略。</w:t>
+              <w:t>好问题。下一个。</w:t>
             </w:r>
           </w:p>
           <w:p>
@@ -2813,12 +2621,6 @@
               <w:right w:val="nil"/>
             </w:tcBorders>
             <w:vAlign w:val="center"/>
-            <w:tcMar>
-              <w:top w:w="120" w:type="dxa"/>
-              <w:left w:w="160" w:type="dxa"/>
-              <w:bottom w:w="120" w:type="dxa"/>
-              <w:right w:w="160" w:type="dxa"/>
-            </w:tcMar>
           </w:tcPr>
           <w:p>
             <w:pPr>
@@ -2849,7 +2651,7 @@
                 <w:color w:val="2C2416"/>
                 <w:sz w:val="32"/>
               </w:rPr>
-              <w:t>故事讲完了。</w:t>
+              <w:t>是。</w:t>
             </w:r>
           </w:p>
           <w:p>
@@ -2897,12 +2699,6 @@
               <w:right w:val="nil"/>
             </w:tcBorders>
             <w:vAlign w:val="center"/>
-            <w:tcMar>
-              <w:top w:w="120" w:type="dxa"/>
-              <w:left w:w="160" w:type="dxa"/>
-              <w:bottom w:w="120" w:type="dxa"/>
-              <w:right w:w="160" w:type="dxa"/>
-            </w:tcMar>
           </w:tcPr>
           <w:p>
             <w:pPr>
@@ -2933,7 +2729,7 @@
                 <w:color w:val="2C2416"/>
                 <w:sz w:val="32"/>
               </w:rPr>
-              <w:t>故事才开始。别追。</w:t>
+              <w:t>不是。</w:t>
             </w:r>
           </w:p>
           <w:p>
@@ -2981,12 +2777,6 @@
               <w:right w:val="nil"/>
             </w:tcBorders>
             <w:vAlign w:val="center"/>
-            <w:tcMar>
-              <w:top w:w="120" w:type="dxa"/>
-              <w:left w:w="160" w:type="dxa"/>
-              <w:bottom w:w="120" w:type="dxa"/>
-              <w:right w:w="160" w:type="dxa"/>
-            </w:tcMar>
           </w:tcPr>
           <w:p>
             <w:pPr>
@@ -3017,7 +2807,7 @@
                 <w:color w:val="2C2416"/>
                 <w:sz w:val="32"/>
               </w:rPr>
-              <w:t>利好是给卖的人听的。</w:t>
+              <w:t>还不是。</w:t>
             </w:r>
           </w:p>
           <w:p>
@@ -3065,12 +2855,6 @@
               <w:right w:val="nil"/>
             </w:tcBorders>
             <w:vAlign w:val="center"/>
-            <w:tcMar>
-              <w:top w:w="120" w:type="dxa"/>
-              <w:left w:w="160" w:type="dxa"/>
-              <w:bottom w:w="120" w:type="dxa"/>
-              <w:right w:w="160" w:type="dxa"/>
-            </w:tcMar>
           </w:tcPr>
           <w:p>
             <w:pPr>
@@ -3101,7 +2885,7 @@
                 <w:color w:val="2C2416"/>
                 <w:sz w:val="32"/>
               </w:rPr>
-              <w:t>利空里有价格。</w:t>
+              <w:t>可以。</w:t>
             </w:r>
           </w:p>
           <w:p>
@@ -3149,12 +2933,6 @@
               <w:right w:val="nil"/>
             </w:tcBorders>
             <w:vAlign w:val="center"/>
-            <w:tcMar>
-              <w:top w:w="120" w:type="dxa"/>
-              <w:left w:w="160" w:type="dxa"/>
-              <w:bottom w:w="120" w:type="dxa"/>
-              <w:right w:w="160" w:type="dxa"/>
-            </w:tcMar>
           </w:tcPr>
           <w:p>
             <w:pPr>
@@ -3185,7 +2963,7 @@
                 <w:color w:val="2C2416"/>
                 <w:sz w:val="32"/>
               </w:rPr>
-              <w:t>消息是噪音的礼服。</w:t>
+              <w:t>不可以。</w:t>
             </w:r>
           </w:p>
           <w:p>
@@ -3233,12 +3011,6 @@
               <w:right w:val="nil"/>
             </w:tcBorders>
             <w:vAlign w:val="center"/>
-            <w:tcMar>
-              <w:top w:w="120" w:type="dxa"/>
-              <w:left w:w="160" w:type="dxa"/>
-              <w:bottom w:w="120" w:type="dxa"/>
-              <w:right w:w="160" w:type="dxa"/>
-            </w:tcMar>
           </w:tcPr>
           <w:p>
             <w:pPr>
@@ -3269,7 +3041,7 @@
                 <w:color w:val="2C2416"/>
                 <w:sz w:val="32"/>
               </w:rPr>
-              <w:t>公告不是神谕。</w:t>
+              <w:t>绝对不行。</w:t>
             </w:r>
           </w:p>
           <w:p>
@@ -3317,12 +3089,6 @@
               <w:right w:val="nil"/>
             </w:tcBorders>
             <w:vAlign w:val="center"/>
-            <w:tcMar>
-              <w:top w:w="120" w:type="dxa"/>
-              <w:left w:w="160" w:type="dxa"/>
-              <w:bottom w:w="120" w:type="dxa"/>
-              <w:right w:w="160" w:type="dxa"/>
-            </w:tcMar>
           </w:tcPr>
           <w:p>
             <w:pPr>
@@ -3353,7 +3119,7 @@
                 <w:color w:val="2C2416"/>
                 <w:sz w:val="32"/>
               </w:rPr>
-              <w:t>别解释 K 线。</w:t>
+              <w:t>也许。</w:t>
             </w:r>
           </w:p>
           <w:p>
@@ -3401,12 +3167,6 @@
               <w:right w:val="nil"/>
             </w:tcBorders>
             <w:vAlign w:val="center"/>
-            <w:tcMar>
-              <w:top w:w="120" w:type="dxa"/>
-              <w:left w:w="160" w:type="dxa"/>
-              <w:bottom w:w="120" w:type="dxa"/>
-              <w:right w:w="160" w:type="dxa"/>
-            </w:tcMar>
           </w:tcPr>
           <w:p>
             <w:pPr>
@@ -3437,7 +3197,7 @@
                 <w:color w:val="2C2416"/>
                 <w:sz w:val="32"/>
               </w:rPr>
-              <w:t>K 线在解释你。</w:t>
+              <w:t>再说。</w:t>
             </w:r>
           </w:p>
           <w:p>
@@ -3485,12 +3245,6 @@
               <w:right w:val="nil"/>
             </w:tcBorders>
             <w:vAlign w:val="center"/>
-            <w:tcMar>
-              <w:top w:w="120" w:type="dxa"/>
-              <w:left w:w="160" w:type="dxa"/>
-              <w:bottom w:w="120" w:type="dxa"/>
-              <w:right w:w="160" w:type="dxa"/>
-            </w:tcMar>
           </w:tcPr>
           <w:p>
             <w:pPr>
@@ -3521,7 +3275,7 @@
                 <w:color w:val="2C2416"/>
                 <w:sz w:val="32"/>
               </w:rPr>
-              <w:t>基本面不会在今晚改写。</w:t>
+              <w:t>当然。</w:t>
             </w:r>
           </w:p>
           <w:p>
@@ -3569,12 +3323,6 @@
               <w:right w:val="nil"/>
             </w:tcBorders>
             <w:vAlign w:val="center"/>
-            <w:tcMar>
-              <w:top w:w="120" w:type="dxa"/>
-              <w:left w:w="160" w:type="dxa"/>
-              <w:bottom w:w="120" w:type="dxa"/>
-              <w:right w:w="160" w:type="dxa"/>
-            </w:tcMar>
           </w:tcPr>
           <w:p>
             <w:pPr>
@@ -3605,7 +3353,7 @@
                 <w:color w:val="2C2416"/>
                 <w:sz w:val="32"/>
               </w:rPr>
-              <w:t>技术面在替情绪说话。</w:t>
+              <w:t>当然不。</w:t>
             </w:r>
           </w:p>
           <w:p>
@@ -3653,12 +3401,6 @@
               <w:right w:val="nil"/>
             </w:tcBorders>
             <w:vAlign w:val="center"/>
-            <w:tcMar>
-              <w:top w:w="120" w:type="dxa"/>
-              <w:left w:w="160" w:type="dxa"/>
-              <w:bottom w:w="120" w:type="dxa"/>
-              <w:right w:w="160" w:type="dxa"/>
-            </w:tcMar>
           </w:tcPr>
           <w:p>
             <w:pPr>
@@ -3689,7 +3431,7 @@
                 <w:color w:val="2C2416"/>
                 <w:sz w:val="32"/>
               </w:rPr>
-              <w:t>你没有边。</w:t>
+              <w:t>随缘。</w:t>
             </w:r>
           </w:p>
           <w:p>
@@ -3737,12 +3479,6 @@
               <w:right w:val="nil"/>
             </w:tcBorders>
             <w:vAlign w:val="center"/>
-            <w:tcMar>
-              <w:top w:w="120" w:type="dxa"/>
-              <w:left w:w="160" w:type="dxa"/>
-              <w:bottom w:w="120" w:type="dxa"/>
-              <w:right w:w="160" w:type="dxa"/>
-            </w:tcMar>
           </w:tcPr>
           <w:p>
             <w:pPr>
@@ -3773,7 +3509,7 @@
                 <w:color w:val="2C2416"/>
                 <w:sz w:val="32"/>
               </w:rPr>
-              <w:t>先设边，再动手。</w:t>
+              <w:t>嗯。</w:t>
             </w:r>
           </w:p>
           <w:p>
@@ -3821,12 +3557,6 @@
               <w:right w:val="nil"/>
             </w:tcBorders>
             <w:vAlign w:val="center"/>
-            <w:tcMar>
-              <w:top w:w="120" w:type="dxa"/>
-              <w:left w:w="160" w:type="dxa"/>
-              <w:bottom w:w="120" w:type="dxa"/>
-              <w:right w:w="160" w:type="dxa"/>
-            </w:tcMar>
           </w:tcPr>
           <w:p>
             <w:pPr>
@@ -3857,7 +3587,7 @@
                 <w:color w:val="2C2416"/>
                 <w:sz w:val="32"/>
               </w:rPr>
-              <w:t>止损不是认输。</w:t>
+              <w:t>行吧。</w:t>
             </w:r>
           </w:p>
           <w:p>
@@ -3905,12 +3635,6 @@
               <w:right w:val="nil"/>
             </w:tcBorders>
             <w:vAlign w:val="center"/>
-            <w:tcMar>
-              <w:top w:w="120" w:type="dxa"/>
-              <w:left w:w="160" w:type="dxa"/>
-              <w:bottom w:w="120" w:type="dxa"/>
-              <w:right w:w="160" w:type="dxa"/>
-            </w:tcMar>
           </w:tcPr>
           <w:p>
             <w:pPr>
@@ -3941,7 +3665,7 @@
                 <w:color w:val="2C2416"/>
                 <w:sz w:val="32"/>
               </w:rPr>
-              <w:t>止盈不是告别。</w:t>
+              <w:t>先喝水。</w:t>
             </w:r>
           </w:p>
           <w:p>
@@ -3989,12 +3713,6 @@
               <w:right w:val="nil"/>
             </w:tcBorders>
             <w:vAlign w:val="center"/>
-            <w:tcMar>
-              <w:top w:w="120" w:type="dxa"/>
-              <w:left w:w="160" w:type="dxa"/>
-              <w:bottom w:w="120" w:type="dxa"/>
-              <w:right w:w="160" w:type="dxa"/>
-            </w:tcMar>
           </w:tcPr>
           <w:p>
             <w:pPr>
@@ -4025,7 +3743,7 @@
                 <w:color w:val="2C2416"/>
                 <w:sz w:val="32"/>
               </w:rPr>
-              <w:t>让利润跑。</w:t>
+              <w:t>先睡觉。</w:t>
             </w:r>
           </w:p>
           <w:p>
@@ -4073,12 +3791,6 @@
               <w:right w:val="nil"/>
             </w:tcBorders>
             <w:vAlign w:val="center"/>
-            <w:tcMar>
-              <w:top w:w="120" w:type="dxa"/>
-              <w:left w:w="160" w:type="dxa"/>
-              <w:bottom w:w="120" w:type="dxa"/>
-              <w:right w:w="160" w:type="dxa"/>
-            </w:tcMar>
           </w:tcPr>
           <w:p>
             <w:pPr>
@@ -4109,7 +3821,7 @@
                 <w:color w:val="2C2416"/>
                 <w:sz w:val="32"/>
               </w:rPr>
-              <w:t>别让亏损睡在账户里。</w:t>
+              <w:t>先开窗。</w:t>
             </w:r>
           </w:p>
           <w:p>
@@ -4157,12 +3869,6 @@
               <w:right w:val="nil"/>
             </w:tcBorders>
             <w:vAlign w:val="center"/>
-            <w:tcMar>
-              <w:top w:w="120" w:type="dxa"/>
-              <w:left w:w="160" w:type="dxa"/>
-              <w:bottom w:w="120" w:type="dxa"/>
-              <w:right w:w="160" w:type="dxa"/>
-            </w:tcMar>
           </w:tcPr>
           <w:p>
             <w:pPr>
@@ -4193,7 +3899,7 @@
                 <w:color w:val="2C2416"/>
                 <w:sz w:val="32"/>
               </w:rPr>
-              <w:t>规则写在下跌之前。</w:t>
+              <w:t>闭眼。还在吗？</w:t>
             </w:r>
           </w:p>
           <w:p>
@@ -4241,12 +3947,6 @@
               <w:right w:val="nil"/>
             </w:tcBorders>
             <w:vAlign w:val="center"/>
-            <w:tcMar>
-              <w:top w:w="120" w:type="dxa"/>
-              <w:left w:w="160" w:type="dxa"/>
-              <w:bottom w:w="120" w:type="dxa"/>
-              <w:right w:w="160" w:type="dxa"/>
-            </w:tcMar>
           </w:tcPr>
           <w:p>
             <w:pPr>
@@ -4277,7 +3977,7 @@
                 <w:color w:val="2C2416"/>
                 <w:sz w:val="32"/>
               </w:rPr>
-              <w:t>你改规则，是因为疼。</w:t>
+              <w:t>今天的云不签字。</w:t>
             </w:r>
           </w:p>
           <w:p>
@@ -4325,12 +4025,6 @@
               <w:right w:val="nil"/>
             </w:tcBorders>
             <w:vAlign w:val="center"/>
-            <w:tcMar>
-              <w:top w:w="120" w:type="dxa"/>
-              <w:left w:w="160" w:type="dxa"/>
-              <w:bottom w:w="120" w:type="dxa"/>
-              <w:right w:w="160" w:type="dxa"/>
-            </w:tcMar>
           </w:tcPr>
           <w:p>
             <w:pPr>
@@ -4361,7 +4055,7 @@
                 <w:color w:val="2C2416"/>
                 <w:sz w:val="32"/>
               </w:rPr>
-              <w:t>疼的时候不要决策。</w:t>
+              <w:t>雨还没停。</w:t>
             </w:r>
           </w:p>
           <w:p>
@@ -4409,12 +4103,6 @@
               <w:right w:val="nil"/>
             </w:tcBorders>
             <w:vAlign w:val="center"/>
-            <w:tcMar>
-              <w:top w:w="120" w:type="dxa"/>
-              <w:left w:w="160" w:type="dxa"/>
-              <w:bottom w:w="120" w:type="dxa"/>
-              <w:right w:w="160" w:type="dxa"/>
-            </w:tcMar>
           </w:tcPr>
           <w:p>
             <w:pPr>
@@ -4445,7 +4133,7 @@
                 <w:color w:val="2C2416"/>
                 <w:sz w:val="32"/>
               </w:rPr>
-              <w:t>饿的时候不要决策。</w:t>
+              <w:t>它在排队。</w:t>
             </w:r>
           </w:p>
           <w:p>
@@ -4493,12 +4181,6 @@
               <w:right w:val="nil"/>
             </w:tcBorders>
             <w:vAlign w:val="center"/>
-            <w:tcMar>
-              <w:top w:w="120" w:type="dxa"/>
-              <w:left w:w="160" w:type="dxa"/>
-              <w:bottom w:w="120" w:type="dxa"/>
-              <w:right w:w="160" w:type="dxa"/>
-            </w:tcMar>
           </w:tcPr>
           <w:p>
             <w:pPr>
@@ -4529,7 +4211,7 @@
                 <w:color w:val="2C2416"/>
                 <w:sz w:val="32"/>
               </w:rPr>
-              <w:t>兴奋的时候尤其不要。</w:t>
+              <w:t>放下手机，数三秒。</w:t>
             </w:r>
           </w:p>
           <w:p>
@@ -4577,12 +4259,6 @@
               <w:right w:val="nil"/>
             </w:tcBorders>
             <w:vAlign w:val="center"/>
-            <w:tcMar>
-              <w:top w:w="120" w:type="dxa"/>
-              <w:left w:w="160" w:type="dxa"/>
-              <w:bottom w:w="120" w:type="dxa"/>
-              <w:right w:w="160" w:type="dxa"/>
-            </w:tcMar>
           </w:tcPr>
           <w:p>
             <w:pPr>
@@ -4613,7 +4289,7 @@
                 <w:color w:val="2C2416"/>
                 <w:sz w:val="32"/>
               </w:rPr>
-              <w:t>报复交易没有胜负。</w:t>
+              <w:t>三秒到了。还是算了。</w:t>
             </w:r>
           </w:p>
           <w:p>
@@ -4661,12 +4337,6 @@
               <w:right w:val="nil"/>
             </w:tcBorders>
             <w:vAlign w:val="center"/>
-            <w:tcMar>
-              <w:top w:w="120" w:type="dxa"/>
-              <w:left w:w="160" w:type="dxa"/>
-              <w:bottom w:w="120" w:type="dxa"/>
-              <w:right w:w="160" w:type="dxa"/>
-            </w:tcMar>
           </w:tcPr>
           <w:p>
             <w:pPr>
@@ -4697,7 +4367,7 @@
                 <w:color w:val="2C2416"/>
                 <w:sz w:val="32"/>
               </w:rPr>
-              <w:t>你在追的不是涨，是确认。</w:t>
+              <w:t>猫不同意。</w:t>
             </w:r>
           </w:p>
           <w:p>
@@ -4745,12 +4415,6 @@
               <w:right w:val="nil"/>
             </w:tcBorders>
             <w:vAlign w:val="center"/>
-            <w:tcMar>
-              <w:top w:w="120" w:type="dxa"/>
-              <w:left w:w="160" w:type="dxa"/>
-              <w:bottom w:w="120" w:type="dxa"/>
-              <w:right w:w="160" w:type="dxa"/>
-            </w:tcMar>
           </w:tcPr>
           <w:p>
             <w:pPr>
@@ -4781,7 +4445,7 @@
                 <w:color w:val="2C2416"/>
                 <w:sz w:val="32"/>
               </w:rPr>
-              <w:t>杀跌是把波动交给别人。</w:t>
+              <w:t>狗同意。你听猫的。</w:t>
             </w:r>
           </w:p>
           <w:p>
@@ -4829,12 +4493,6 @@
               <w:right w:val="nil"/>
             </w:tcBorders>
             <w:vAlign w:val="center"/>
-            <w:tcMar>
-              <w:top w:w="120" w:type="dxa"/>
-              <w:left w:w="160" w:type="dxa"/>
-              <w:bottom w:w="120" w:type="dxa"/>
-              <w:right w:w="160" w:type="dxa"/>
-            </w:tcMar>
           </w:tcPr>
           <w:p>
             <w:pPr>
@@ -4865,7 +4523,7 @@
                 <w:color w:val="2C2416"/>
                 <w:sz w:val="32"/>
               </w:rPr>
-              <w:t>涨时你怕，跌时你信。反过来。</w:t>
+              <w:t>这杯咖啡凉了。</w:t>
             </w:r>
           </w:p>
           <w:p>
@@ -4913,12 +4571,6 @@
               <w:right w:val="nil"/>
             </w:tcBorders>
             <w:vAlign w:val="center"/>
-            <w:tcMar>
-              <w:top w:w="120" w:type="dxa"/>
-              <w:left w:w="160" w:type="dxa"/>
-              <w:bottom w:w="120" w:type="dxa"/>
-              <w:right w:w="160" w:type="dxa"/>
-            </w:tcMar>
           </w:tcPr>
           <w:p>
             <w:pPr>
@@ -4949,7 +4601,7 @@
                 <w:color w:val="2C2416"/>
                 <w:sz w:val="32"/>
               </w:rPr>
-              <w:t>怕踏空，就会踩实坑。</w:t>
+              <w:t>快递在柜里。</w:t>
             </w:r>
           </w:p>
           <w:p>
@@ -4997,12 +4649,6 @@
               <w:right w:val="nil"/>
             </w:tcBorders>
             <w:vAlign w:val="center"/>
-            <w:tcMar>
-              <w:top w:w="120" w:type="dxa"/>
-              <w:left w:w="160" w:type="dxa"/>
-              <w:bottom w:w="120" w:type="dxa"/>
-              <w:right w:w="160" w:type="dxa"/>
-            </w:tcMar>
           </w:tcPr>
           <w:p>
             <w:pPr>
@@ -5033,7 +4679,7 @@
                 <w:color w:val="2C2416"/>
                 <w:sz w:val="32"/>
               </w:rPr>
-              <w:t>踏空不可怕。满仓踏空才可怕。</w:t>
+              <w:t>取了再说。</w:t>
             </w:r>
           </w:p>
           <w:p>
@@ -5081,12 +4727,6 @@
               <w:right w:val="nil"/>
             </w:tcBorders>
             <w:vAlign w:val="center"/>
-            <w:tcMar>
-              <w:top w:w="120" w:type="dxa"/>
-              <w:left w:w="160" w:type="dxa"/>
-              <w:bottom w:w="120" w:type="dxa"/>
-              <w:right w:w="160" w:type="dxa"/>
-            </w:tcMar>
           </w:tcPr>
           <w:p>
             <w:pPr>
@@ -5117,7 +4757,7 @@
                 <w:color w:val="2C2416"/>
                 <w:sz w:val="32"/>
               </w:rPr>
-              <w:t>机会是公共汽车。</w:t>
+              <w:t>电梯来了。让它走。</w:t>
             </w:r>
           </w:p>
           <w:p>
@@ -5165,12 +4805,6 @@
               <w:right w:val="nil"/>
             </w:tcBorders>
             <w:vAlign w:val="center"/>
-            <w:tcMar>
-              <w:top w:w="120" w:type="dxa"/>
-              <w:left w:w="160" w:type="dxa"/>
-              <w:bottom w:w="120" w:type="dxa"/>
-              <w:right w:w="160" w:type="dxa"/>
-            </w:tcMar>
           </w:tcPr>
           <w:p>
             <w:pPr>
@@ -5201,7 +4835,7 @@
                 <w:color w:val="2C2416"/>
                 <w:sz w:val="32"/>
               </w:rPr>
-              <w:t>下一班会来。</w:t>
+              <w:t>下一班。</w:t>
             </w:r>
           </w:p>
           <w:p>
@@ -5249,12 +4883,6 @@
               <w:right w:val="nil"/>
             </w:tcBorders>
             <w:vAlign w:val="center"/>
-            <w:tcMar>
-              <w:top w:w="120" w:type="dxa"/>
-              <w:left w:w="160" w:type="dxa"/>
-              <w:bottom w:w="120" w:type="dxa"/>
-              <w:right w:w="160" w:type="dxa"/>
-            </w:tcMar>
           </w:tcPr>
           <w:p>
             <w:pPr>
@@ -5285,7 +4913,7 @@
                 <w:color w:val="2C2416"/>
                 <w:sz w:val="32"/>
               </w:rPr>
-              <w:t>这班车已经走了。</w:t>
+              <w:t>今天发型不对。</w:t>
             </w:r>
           </w:p>
           <w:p>
@@ -5333,12 +4961,6 @@
               <w:right w:val="nil"/>
             </w:tcBorders>
             <w:vAlign w:val="center"/>
-            <w:tcMar>
-              <w:top w:w="120" w:type="dxa"/>
-              <w:left w:w="160" w:type="dxa"/>
-              <w:bottom w:w="120" w:type="dxa"/>
-              <w:right w:w="160" w:type="dxa"/>
-            </w:tcMar>
           </w:tcPr>
           <w:p>
             <w:pPr>
@@ -5369,7 +4991,7 @@
                 <w:color w:val="2C2416"/>
                 <w:sz w:val="32"/>
               </w:rPr>
-              <w:t>不要跳车。</w:t>
+              <w:t>换个杯子。</w:t>
             </w:r>
           </w:p>
           <w:p>
@@ -5417,12 +5039,6 @@
               <w:right w:val="nil"/>
             </w:tcBorders>
             <w:vAlign w:val="center"/>
-            <w:tcMar>
-              <w:top w:w="120" w:type="dxa"/>
-              <w:left w:w="160" w:type="dxa"/>
-              <w:bottom w:w="120" w:type="dxa"/>
-              <w:right w:w="160" w:type="dxa"/>
-            </w:tcMar>
           </w:tcPr>
           <w:p>
             <w:pPr>
@@ -5453,7 +5069,7 @@
                 <w:color w:val="2C2416"/>
                 <w:sz w:val="32"/>
               </w:rPr>
-              <w:t>站稳再看方向。</w:t>
+              <w:t>Wi-Fi 不稳。</w:t>
             </w:r>
           </w:p>
           <w:p>
@@ -5501,12 +5117,6 @@
               <w:right w:val="nil"/>
             </w:tcBorders>
             <w:vAlign w:val="center"/>
-            <w:tcMar>
-              <w:top w:w="120" w:type="dxa"/>
-              <w:left w:w="160" w:type="dxa"/>
-              <w:bottom w:w="120" w:type="dxa"/>
-              <w:right w:w="160" w:type="dxa"/>
-            </w:tcMar>
           </w:tcPr>
           <w:p>
             <w:pPr>
@@ -5537,7 +5147,7 @@
                 <w:color w:val="2C2416"/>
                 <w:sz w:val="32"/>
               </w:rPr>
-              <w:t>摊平不是勇敢。</w:t>
+              <w:t>充电。再问。</w:t>
             </w:r>
           </w:p>
           <w:p>
@@ -5585,12 +5195,6 @@
               <w:right w:val="nil"/>
             </w:tcBorders>
             <w:vAlign w:val="center"/>
-            <w:tcMar>
-              <w:top w:w="120" w:type="dxa"/>
-              <w:left w:w="160" w:type="dxa"/>
-              <w:bottom w:w="120" w:type="dxa"/>
-              <w:right w:w="160" w:type="dxa"/>
-            </w:tcMar>
           </w:tcPr>
           <w:p>
             <w:pPr>
@@ -5621,7 +5225,7 @@
                 <w:color w:val="2C2416"/>
                 <w:sz w:val="32"/>
               </w:rPr>
-              <w:t>补仓要配新的理由。</w:t>
+              <w:t>电量红了。先插上。</w:t>
             </w:r>
           </w:p>
           <w:p>
@@ -5669,12 +5273,6 @@
               <w:right w:val="nil"/>
             </w:tcBorders>
             <w:vAlign w:val="center"/>
-            <w:tcMar>
-              <w:top w:w="120" w:type="dxa"/>
-              <w:left w:w="160" w:type="dxa"/>
-              <w:bottom w:w="120" w:type="dxa"/>
-              <w:right w:w="160" w:type="dxa"/>
-            </w:tcMar>
           </w:tcPr>
           <w:p>
             <w:pPr>
@@ -5705,7 +5303,7 @@
                 <w:color w:val="2C2416"/>
                 <w:sz w:val="32"/>
               </w:rPr>
-              <w:t>旧理由已经用过了。</w:t>
+              <w:t>闹钟还没响。</w:t>
             </w:r>
           </w:p>
           <w:p>
@@ -5753,12 +5351,6 @@
               <w:right w:val="nil"/>
             </w:tcBorders>
             <w:vAlign w:val="center"/>
-            <w:tcMar>
-              <w:top w:w="120" w:type="dxa"/>
-              <w:left w:w="160" w:type="dxa"/>
-              <w:bottom w:w="120" w:type="dxa"/>
-              <w:right w:w="160" w:type="dxa"/>
-            </w:tcMar>
           </w:tcPr>
           <w:p>
             <w:pPr>
@@ -5789,7 +5381,7 @@
                 <w:color w:val="2C2416"/>
                 <w:sz w:val="32"/>
               </w:rPr>
-              <w:t>不要跟成本谈恋爱。</w:t>
+              <w:t>周末再说。</w:t>
             </w:r>
           </w:p>
           <w:p>
@@ -5837,12 +5429,6 @@
               <w:right w:val="nil"/>
             </w:tcBorders>
             <w:vAlign w:val="center"/>
-            <w:tcMar>
-              <w:top w:w="120" w:type="dxa"/>
-              <w:left w:w="160" w:type="dxa"/>
-              <w:bottom w:w="120" w:type="dxa"/>
-              <w:right w:w="160" w:type="dxa"/>
-            </w:tcMar>
           </w:tcPr>
           <w:p>
             <w:pPr>
@@ -5873,7 +5459,7 @@
                 <w:color w:val="2C2416"/>
                 <w:sz w:val="32"/>
               </w:rPr>
-              <w:t>成本只是你的记忆。</w:t>
+              <w:t>周一的事周一做。</w:t>
             </w:r>
           </w:p>
           <w:p>
@@ -5921,12 +5507,6 @@
               <w:right w:val="nil"/>
             </w:tcBorders>
             <w:vAlign w:val="center"/>
-            <w:tcMar>
-              <w:top w:w="120" w:type="dxa"/>
-              <w:left w:w="160" w:type="dxa"/>
-              <w:bottom w:w="120" w:type="dxa"/>
-              <w:right w:w="160" w:type="dxa"/>
-            </w:tcMar>
           </w:tcPr>
           <w:p>
             <w:pPr>
@@ -5957,7 +5537,7 @@
                 <w:color w:val="2C2416"/>
                 <w:sz w:val="32"/>
               </w:rPr>
-              <w:t>市场不在乎你的成本。</w:t>
+              <w:t>周五下午不适合。</w:t>
             </w:r>
           </w:p>
           <w:p>
@@ -6005,12 +5585,6 @@
               <w:right w:val="nil"/>
             </w:tcBorders>
             <w:vAlign w:val="center"/>
-            <w:tcMar>
-              <w:top w:w="120" w:type="dxa"/>
-              <w:left w:w="160" w:type="dxa"/>
-              <w:bottom w:w="120" w:type="dxa"/>
-              <w:right w:w="160" w:type="dxa"/>
-            </w:tcMar>
           </w:tcPr>
           <w:p>
             <w:pPr>
@@ -6041,7 +5615,7 @@
                 <w:color w:val="2C2416"/>
                 <w:sz w:val="32"/>
               </w:rPr>
-              <w:t>解套不是目标。</w:t>
+              <w:t>它去旅行了。</w:t>
             </w:r>
           </w:p>
           <w:p>
@@ -6089,12 +5663,6 @@
               <w:right w:val="nil"/>
             </w:tcBorders>
             <w:vAlign w:val="center"/>
-            <w:tcMar>
-              <w:top w:w="120" w:type="dxa"/>
-              <w:left w:w="160" w:type="dxa"/>
-              <w:bottom w:w="120" w:type="dxa"/>
-              <w:right w:w="160" w:type="dxa"/>
-            </w:tcMar>
           </w:tcPr>
           <w:p>
             <w:pPr>
@@ -6125,7 +5693,7 @@
                 <w:color w:val="2C2416"/>
                 <w:sz w:val="32"/>
               </w:rPr>
-              <w:t>活着才是。</w:t>
+              <w:t>钥匙在另一件外套。</w:t>
             </w:r>
           </w:p>
           <w:p>
@@ -6173,12 +5741,6 @@
               <w:right w:val="nil"/>
             </w:tcBorders>
             <w:vAlign w:val="center"/>
-            <w:tcMar>
-              <w:top w:w="120" w:type="dxa"/>
-              <w:left w:w="160" w:type="dxa"/>
-              <w:bottom w:w="120" w:type="dxa"/>
-              <w:right w:w="160" w:type="dxa"/>
-            </w:tcMar>
           </w:tcPr>
           <w:p>
             <w:pPr>
@@ -6209,7 +5771,7 @@
                 <w:color w:val="2C2416"/>
                 <w:sz w:val="32"/>
               </w:rPr>
-              <w:t>本金是门票。</w:t>
+              <w:t>门没锁。也别进。</w:t>
             </w:r>
           </w:p>
           <w:p>
@@ -6257,12 +5819,6 @@
               <w:right w:val="nil"/>
             </w:tcBorders>
             <w:vAlign w:val="center"/>
-            <w:tcMar>
-              <w:top w:w="120" w:type="dxa"/>
-              <w:left w:w="160" w:type="dxa"/>
-              <w:bottom w:w="120" w:type="dxa"/>
-              <w:right w:w="160" w:type="dxa"/>
-            </w:tcMar>
           </w:tcPr>
           <w:p>
             <w:pPr>
@@ -6293,7 +5849,7 @@
                 <w:color w:val="2C2416"/>
                 <w:sz w:val="32"/>
               </w:rPr>
-              <w:t>先保住门票。</w:t>
+              <w:t>沙发会陷进去。</w:t>
             </w:r>
           </w:p>
           <w:p>
@@ -6341,12 +5897,6 @@
               <w:right w:val="nil"/>
             </w:tcBorders>
             <w:vAlign w:val="center"/>
-            <w:tcMar>
-              <w:top w:w="120" w:type="dxa"/>
-              <w:left w:w="160" w:type="dxa"/>
-              <w:bottom w:w="120" w:type="dxa"/>
-              <w:right w:w="160" w:type="dxa"/>
-            </w:tcMar>
           </w:tcPr>
           <w:p>
             <w:pPr>
@@ -6377,7 +5927,7 @@
                 <w:color w:val="2C2416"/>
                 <w:sz w:val="32"/>
               </w:rPr>
-              <w:t>盈利是租来的。</w:t>
+              <w:t>窗台风大。</w:t>
             </w:r>
           </w:p>
           <w:p>
@@ -6425,12 +5975,6 @@
               <w:right w:val="nil"/>
             </w:tcBorders>
             <w:vAlign w:val="center"/>
-            <w:tcMar>
-              <w:top w:w="120" w:type="dxa"/>
-              <w:left w:w="160" w:type="dxa"/>
-              <w:bottom w:w="120" w:type="dxa"/>
-              <w:right w:w="160" w:type="dxa"/>
-            </w:tcMar>
           </w:tcPr>
           <w:p>
             <w:pPr>
@@ -6461,7 +6005,7 @@
                 <w:color w:val="2C2416"/>
                 <w:sz w:val="32"/>
               </w:rPr>
-              <w:t>回撤会来收租。</w:t>
+              <w:t>绿植比你淡定。</w:t>
             </w:r>
           </w:p>
           <w:p>
@@ -6509,12 +6053,6 @@
               <w:right w:val="nil"/>
             </w:tcBorders>
             <w:vAlign w:val="center"/>
-            <w:tcMar>
-              <w:top w:w="120" w:type="dxa"/>
-              <w:left w:w="160" w:type="dxa"/>
-              <w:bottom w:w="120" w:type="dxa"/>
-              <w:right w:w="160" w:type="dxa"/>
-            </w:tcMar>
           </w:tcPr>
           <w:p>
             <w:pPr>
@@ -6545,7 +6083,7 @@
                 <w:color w:val="2C2416"/>
                 <w:sz w:val="32"/>
               </w:rPr>
-              <w:t>给回撤留房间。</w:t>
+              <w:t>鱼在吐泡。当同意。</w:t>
             </w:r>
           </w:p>
           <w:p>
@@ -6593,12 +6131,6 @@
               <w:right w:val="nil"/>
             </w:tcBorders>
             <w:vAlign w:val="center"/>
-            <w:tcMar>
-              <w:top w:w="120" w:type="dxa"/>
-              <w:left w:w="160" w:type="dxa"/>
-              <w:bottom w:w="120" w:type="dxa"/>
-              <w:right w:w="160" w:type="dxa"/>
-            </w:tcMar>
           </w:tcPr>
           <w:p>
             <w:pPr>
@@ -6629,7 +6161,7 @@
                 <w:color w:val="2C2416"/>
                 <w:sz w:val="32"/>
               </w:rPr>
-              <w:t>波动不是风险。破产才是。</w:t>
+              <w:t>鱼在吐泡。当不同意。</w:t>
             </w:r>
           </w:p>
           <w:p>
@@ -6677,12 +6209,6 @@
               <w:right w:val="nil"/>
             </w:tcBorders>
             <w:vAlign w:val="center"/>
-            <w:tcMar>
-              <w:top w:w="120" w:type="dxa"/>
-              <w:left w:w="160" w:type="dxa"/>
-              <w:bottom w:w="120" w:type="dxa"/>
-              <w:right w:w="160" w:type="dxa"/>
-            </w:tcMar>
           </w:tcPr>
           <w:p>
             <w:pPr>
@@ -6713,7 +6239,7 @@
                 <w:color w:val="2C2416"/>
                 <w:sz w:val="32"/>
               </w:rPr>
-              <w:t>你能承受的，才叫仓位。</w:t>
+              <w:t>天气预报在撒谎。</w:t>
             </w:r>
           </w:p>
           <w:p>
@@ -6761,12 +6287,6 @@
               <w:right w:val="nil"/>
             </w:tcBorders>
             <w:vAlign w:val="center"/>
-            <w:tcMar>
-              <w:top w:w="120" w:type="dxa"/>
-              <w:left w:w="160" w:type="dxa"/>
-              <w:bottom w:w="120" w:type="dxa"/>
-              <w:right w:w="160" w:type="dxa"/>
-            </w:tcMar>
           </w:tcPr>
           <w:p>
             <w:pPr>
@@ -6797,7 +6317,7 @@
                 <w:color w:val="2C2416"/>
                 <w:sz w:val="32"/>
               </w:rPr>
-              <w:t>睡得着，才叫仓位。</w:t>
+              <w:t>带伞。别带心情。</w:t>
             </w:r>
           </w:p>
           <w:p>
@@ -6845,12 +6365,6 @@
               <w:right w:val="nil"/>
             </w:tcBorders>
             <w:vAlign w:val="center"/>
-            <w:tcMar>
-              <w:top w:w="120" w:type="dxa"/>
-              <w:left w:w="160" w:type="dxa"/>
-              <w:bottom w:w="120" w:type="dxa"/>
-              <w:right w:w="160" w:type="dxa"/>
-            </w:tcMar>
           </w:tcPr>
           <w:p>
             <w:pPr>
@@ -6881,7 +6395,7 @@
                 <w:color w:val="2C2416"/>
                 <w:sz w:val="32"/>
               </w:rPr>
-              <w:t>如果必须盯盘，仓位就重了。</w:t>
+              <w:t>太阳还没同意。</w:t>
             </w:r>
           </w:p>
           <w:p>
@@ -6929,12 +6443,6 @@
               <w:right w:val="nil"/>
             </w:tcBorders>
             <w:vAlign w:val="center"/>
-            <w:tcMar>
-              <w:top w:w="120" w:type="dxa"/>
-              <w:left w:w="160" w:type="dxa"/>
-              <w:bottom w:w="120" w:type="dxa"/>
-              <w:right w:w="160" w:type="dxa"/>
-            </w:tcMar>
           </w:tcPr>
           <w:p>
             <w:pPr>
@@ -6965,7 +6473,7 @@
                 <w:color w:val="2C2416"/>
                 <w:sz w:val="32"/>
               </w:rPr>
-              <w:t>关掉软件。</w:t>
+              <w:t>你饿了。</w:t>
             </w:r>
           </w:p>
           <w:p>
@@ -7013,12 +6521,6 @@
               <w:right w:val="nil"/>
             </w:tcBorders>
             <w:vAlign w:val="center"/>
-            <w:tcMar>
-              <w:top w:w="120" w:type="dxa"/>
-              <w:left w:w="160" w:type="dxa"/>
-              <w:bottom w:w="120" w:type="dxa"/>
-              <w:right w:w="160" w:type="dxa"/>
-            </w:tcMar>
           </w:tcPr>
           <w:p>
             <w:pPr>
@@ -7049,7 +6551,7 @@
                 <w:color w:val="2C2416"/>
                 <w:sz w:val="32"/>
               </w:rPr>
-              <w:t>今天看一次就够。</w:t>
+              <w:t>你困了。</w:t>
             </w:r>
           </w:p>
           <w:p>
@@ -7097,12 +6599,6 @@
               <w:right w:val="nil"/>
             </w:tcBorders>
             <w:vAlign w:val="center"/>
-            <w:tcMar>
-              <w:top w:w="120" w:type="dxa"/>
-              <w:left w:w="160" w:type="dxa"/>
-              <w:bottom w:w="120" w:type="dxa"/>
-              <w:right w:w="160" w:type="dxa"/>
-            </w:tcMar>
           </w:tcPr>
           <w:p>
             <w:pPr>
@@ -7133,7 +6629,7 @@
                 <w:color w:val="2C2416"/>
                 <w:sz w:val="32"/>
               </w:rPr>
-              <w:t>刷新不会改变价格。</w:t>
+              <w:t>你只是手痒。</w:t>
             </w:r>
           </w:p>
           <w:p>
@@ -7181,12 +6677,6 @@
               <w:right w:val="nil"/>
             </w:tcBorders>
             <w:vAlign w:val="center"/>
-            <w:tcMar>
-              <w:top w:w="120" w:type="dxa"/>
-              <w:left w:w="160" w:type="dxa"/>
-              <w:bottom w:w="120" w:type="dxa"/>
-              <w:right w:w="160" w:type="dxa"/>
-            </w:tcMar>
           </w:tcPr>
           <w:p>
             <w:pPr>
@@ -7217,7 +6707,7 @@
                 <w:color w:val="2C2416"/>
                 <w:sz w:val="32"/>
               </w:rPr>
-              <w:t>刷新只会改变你。</w:t>
+              <w:t>下楼买奶茶。</w:t>
             </w:r>
           </w:p>
           <w:p>
@@ -7265,12 +6755,6 @@
               <w:right w:val="nil"/>
             </w:tcBorders>
             <w:vAlign w:val="center"/>
-            <w:tcMar>
-              <w:top w:w="120" w:type="dxa"/>
-              <w:left w:w="160" w:type="dxa"/>
-              <w:bottom w:w="120" w:type="dxa"/>
-              <w:right w:w="160" w:type="dxa"/>
-            </w:tcMar>
           </w:tcPr>
           <w:p>
             <w:pPr>
@@ -7301,7 +6785,7 @@
                 <w:color w:val="2C2416"/>
                 <w:sz w:val="32"/>
               </w:rPr>
-              <w:t>无聊不是买入理由。</w:t>
+              <w:t>转角有猫。</w:t>
             </w:r>
           </w:p>
           <w:p>
@@ -7349,12 +6833,6 @@
               <w:right w:val="nil"/>
             </w:tcBorders>
             <w:vAlign w:val="center"/>
-            <w:tcMar>
-              <w:top w:w="120" w:type="dxa"/>
-              <w:left w:w="160" w:type="dxa"/>
-              <w:bottom w:w="120" w:type="dxa"/>
-              <w:right w:w="160" w:type="dxa"/>
-            </w:tcMar>
           </w:tcPr>
           <w:p>
             <w:pPr>
@@ -7385,7 +6863,7 @@
                 <w:color w:val="2C2416"/>
                 <w:sz w:val="32"/>
               </w:rPr>
-              <w:t>热闹不是买入理由。</w:t>
+              <w:t>跟着猫。</w:t>
             </w:r>
           </w:p>
           <w:p>
@@ -7433,12 +6911,6 @@
               <w:right w:val="nil"/>
             </w:tcBorders>
             <w:vAlign w:val="center"/>
-            <w:tcMar>
-              <w:top w:w="120" w:type="dxa"/>
-              <w:left w:w="160" w:type="dxa"/>
-              <w:bottom w:w="120" w:type="dxa"/>
-              <w:right w:w="160" w:type="dxa"/>
-            </w:tcMar>
           </w:tcPr>
           <w:p>
             <w:pPr>
@@ -7469,7 +6941,7 @@
                 <w:color w:val="2C2416"/>
                 <w:sz w:val="32"/>
               </w:rPr>
-              <w:t>朋友赚到了，不是理由。</w:t>
+              <w:t>群已禁言。很好。</w:t>
             </w:r>
           </w:p>
           <w:p>
@@ -7517,12 +6989,6 @@
               <w:right w:val="nil"/>
             </w:tcBorders>
             <w:vAlign w:val="center"/>
-            <w:tcMar>
-              <w:top w:w="120" w:type="dxa"/>
-              <w:left w:w="160" w:type="dxa"/>
-              <w:bottom w:w="120" w:type="dxa"/>
-              <w:right w:w="160" w:type="dxa"/>
-            </w:tcMar>
           </w:tcPr>
           <w:p>
             <w:pPr>
@@ -7553,7 +7019,7 @@
                 <w:color w:val="2C2416"/>
                 <w:sz w:val="32"/>
               </w:rPr>
-              <w:t>群里在喊，更不是。</w:t>
+              <w:t>@所有人 当空气。</w:t>
             </w:r>
           </w:p>
           <w:p>
@@ -7601,12 +7067,6 @@
               <w:right w:val="nil"/>
             </w:tcBorders>
             <w:vAlign w:val="center"/>
-            <w:tcMar>
-              <w:top w:w="120" w:type="dxa"/>
-              <w:left w:w="160" w:type="dxa"/>
-              <w:bottom w:w="120" w:type="dxa"/>
-              <w:right w:w="160" w:type="dxa"/>
-            </w:tcMar>
           </w:tcPr>
           <w:p>
             <w:pPr>
@@ -7637,7 +7097,7 @@
                 <w:color w:val="2C2416"/>
                 <w:sz w:val="32"/>
               </w:rPr>
-              <w:t>别听群。</w:t>
+              <w:t>已读不回。</w:t>
             </w:r>
           </w:p>
           <w:p>
@@ -7685,12 +7145,6 @@
               <w:right w:val="nil"/>
             </w:tcBorders>
             <w:vAlign w:val="center"/>
-            <w:tcMar>
-              <w:top w:w="120" w:type="dxa"/>
-              <w:left w:w="160" w:type="dxa"/>
-              <w:bottom w:w="120" w:type="dxa"/>
-              <w:right w:w="160" w:type="dxa"/>
-            </w:tcMar>
           </w:tcPr>
           <w:p>
             <w:pPr>
@@ -7721,7 +7175,7 @@
                 <w:color w:val="2C2416"/>
                 <w:sz w:val="32"/>
               </w:rPr>
-              <w:t>别听荐股。</w:t>
+              <w:t>撤回那条。</w:t>
             </w:r>
           </w:p>
           <w:p>
@@ -7769,12 +7223,6 @@
               <w:right w:val="nil"/>
             </w:tcBorders>
             <w:vAlign w:val="center"/>
-            <w:tcMar>
-              <w:top w:w="120" w:type="dxa"/>
-              <w:left w:w="160" w:type="dxa"/>
-              <w:bottom w:w="120" w:type="dxa"/>
-              <w:right w:w="160" w:type="dxa"/>
-            </w:tcMar>
           </w:tcPr>
           <w:p>
             <w:pPr>
@@ -7805,7 +7253,7 @@
                 <w:color w:val="2C2416"/>
                 <w:sz w:val="32"/>
               </w:rPr>
-              <w:t>把决策权收回来。</w:t>
+              <w:t>它不认识你的名字。</w:t>
             </w:r>
           </w:p>
           <w:p>
@@ -7853,12 +7301,6 @@
               <w:right w:val="nil"/>
             </w:tcBorders>
             <w:vAlign w:val="center"/>
-            <w:tcMar>
-              <w:top w:w="120" w:type="dxa"/>
-              <w:left w:w="160" w:type="dxa"/>
-              <w:bottom w:w="120" w:type="dxa"/>
-              <w:right w:w="160" w:type="dxa"/>
-            </w:tcMar>
           </w:tcPr>
           <w:p>
             <w:pPr>
@@ -7889,7 +7331,7 @@
                 <w:color w:val="2C2416"/>
                 <w:sz w:val="32"/>
               </w:rPr>
-              <w:t>思考不等于下单。</w:t>
+              <w:t>K 线在打哈欠。</w:t>
             </w:r>
           </w:p>
           <w:p>
@@ -7937,12 +7379,6 @@
               <w:right w:val="nil"/>
             </w:tcBorders>
             <w:vAlign w:val="center"/>
-            <w:tcMar>
-              <w:top w:w="120" w:type="dxa"/>
-              <w:left w:w="160" w:type="dxa"/>
-              <w:bottom w:w="120" w:type="dxa"/>
-              <w:right w:w="160" w:type="dxa"/>
-            </w:tcMar>
           </w:tcPr>
           <w:p>
             <w:pPr>
@@ -7973,7 +7409,7 @@
                 <w:color w:val="2C2416"/>
                 <w:sz w:val="32"/>
               </w:rPr>
-              <w:t>盘中不要发明。</w:t>
+              <w:t>盘面像没睡醒。</w:t>
             </w:r>
           </w:p>
           <w:p>
@@ -8021,12 +7457,6 @@
               <w:right w:val="nil"/>
             </w:tcBorders>
             <w:vAlign w:val="center"/>
-            <w:tcMar>
-              <w:top w:w="120" w:type="dxa"/>
-              <w:left w:w="160" w:type="dxa"/>
-              <w:bottom w:w="120" w:type="dxa"/>
-              <w:right w:w="160" w:type="dxa"/>
-            </w:tcMar>
           </w:tcPr>
           <w:p>
             <w:pPr>
@@ -8057,7 +7487,7 @@
                 <w:color w:val="2C2416"/>
                 <w:sz w:val="32"/>
               </w:rPr>
-              <w:t>热手会烫。</w:t>
+              <w:t>站稳扶好。</w:t>
             </w:r>
           </w:p>
           <w:p>
@@ -8105,12 +7535,6 @@
               <w:right w:val="nil"/>
             </w:tcBorders>
             <w:vAlign w:val="center"/>
-            <w:tcMar>
-              <w:top w:w="120" w:type="dxa"/>
-              <w:left w:w="160" w:type="dxa"/>
-              <w:bottom w:w="120" w:type="dxa"/>
-              <w:right w:w="160" w:type="dxa"/>
-            </w:tcMar>
           </w:tcPr>
           <w:p>
             <w:pPr>
@@ -8141,7 +7565,7 @@
                 <w:color w:val="2C2416"/>
                 <w:sz w:val="32"/>
               </w:rPr>
-              <w:t>冷手会抖。</w:t>
+              <w:t>下车。这站不是你的。</w:t>
             </w:r>
           </w:p>
           <w:p>
@@ -8189,12 +7613,6 @@
               <w:right w:val="nil"/>
             </w:tcBorders>
             <w:vAlign w:val="center"/>
-            <w:tcMar>
-              <w:top w:w="120" w:type="dxa"/>
-              <w:left w:w="160" w:type="dxa"/>
-              <w:bottom w:w="120" w:type="dxa"/>
-              <w:right w:w="160" w:type="dxa"/>
-            </w:tcMar>
           </w:tcPr>
           <w:p>
             <w:pPr>
@@ -8225,7 +7643,7 @@
                 <w:color w:val="2C2416"/>
                 <w:sz w:val="32"/>
               </w:rPr>
-              <w:t>停一停，手会回来。</w:t>
+              <w:t>导航在胡说。</w:t>
             </w:r>
           </w:p>
           <w:p>
@@ -8273,12 +7691,6 @@
               <w:right w:val="nil"/>
             </w:tcBorders>
             <w:vAlign w:val="center"/>
-            <w:tcMar>
-              <w:top w:w="120" w:type="dxa"/>
-              <w:left w:w="160" w:type="dxa"/>
-              <w:bottom w:w="120" w:type="dxa"/>
-              <w:right w:w="160" w:type="dxa"/>
-            </w:tcMar>
           </w:tcPr>
           <w:p>
             <w:pPr>
@@ -8309,7 +7721,7 @@
                 <w:color w:val="2C2416"/>
                 <w:sz w:val="32"/>
               </w:rPr>
-              <w:t>休息是交易的一部分。</w:t>
+              <w:t>今日休息。</w:t>
             </w:r>
           </w:p>
           <w:p>
@@ -8357,12 +7769,6 @@
               <w:right w:val="nil"/>
             </w:tcBorders>
             <w:vAlign w:val="center"/>
-            <w:tcMar>
-              <w:top w:w="120" w:type="dxa"/>
-              <w:left w:w="160" w:type="dxa"/>
-              <w:bottom w:w="120" w:type="dxa"/>
-              <w:right w:w="160" w:type="dxa"/>
-            </w:tcMar>
           </w:tcPr>
           <w:p>
             <w:pPr>
@@ -8393,7 +7799,7 @@
                 <w:color w:val="2C2416"/>
                 <w:sz w:val="32"/>
               </w:rPr>
-              <w:t>空仓的日子也算交易日。</w:t>
+              <w:t>名额已满。</w:t>
             </w:r>
           </w:p>
           <w:p>
@@ -8441,12 +7847,6 @@
               <w:right w:val="nil"/>
             </w:tcBorders>
             <w:vAlign w:val="center"/>
-            <w:tcMar>
-              <w:top w:w="120" w:type="dxa"/>
-              <w:left w:w="160" w:type="dxa"/>
-              <w:bottom w:w="120" w:type="dxa"/>
-              <w:right w:w="160" w:type="dxa"/>
-            </w:tcMar>
           </w:tcPr>
           <w:p>
             <w:pPr>
@@ -8477,7 +7877,7 @@
                 <w:color w:val="2C2416"/>
                 <w:sz w:val="32"/>
               </w:rPr>
-              <w:t>等待不是无能。</w:t>
+              <w:t>请取号。</w:t>
             </w:r>
           </w:p>
           <w:p>
@@ -8525,12 +7925,6 @@
               <w:right w:val="nil"/>
             </w:tcBorders>
             <w:vAlign w:val="center"/>
-            <w:tcMar>
-              <w:top w:w="120" w:type="dxa"/>
-              <w:left w:w="160" w:type="dxa"/>
-              <w:bottom w:w="120" w:type="dxa"/>
-              <w:right w:w="160" w:type="dxa"/>
-            </w:tcMar>
           </w:tcPr>
           <w:p>
             <w:pPr>
@@ -8561,7 +7955,7 @@
                 <w:color w:val="2C2416"/>
                 <w:sz w:val="32"/>
               </w:rPr>
-              <w:t>等待是仓位的另一种形式。</w:t>
+              <w:t>窗口关上了。</w:t>
             </w:r>
           </w:p>
           <w:p>
@@ -8609,12 +8003,6 @@
               <w:right w:val="nil"/>
             </w:tcBorders>
             <w:vAlign w:val="center"/>
-            <w:tcMar>
-              <w:top w:w="120" w:type="dxa"/>
-              <w:left w:w="160" w:type="dxa"/>
-              <w:bottom w:w="120" w:type="dxa"/>
-              <w:right w:w="160" w:type="dxa"/>
-            </w:tcMar>
           </w:tcPr>
           <w:p>
             <w:pPr>
@@ -8645,7 +8033,7 @@
                 <w:color w:val="2C2416"/>
                 <w:sz w:val="32"/>
               </w:rPr>
-              <w:t>现在该等。</w:t>
+              <w:t>别转了。坐着。</w:t>
             </w:r>
           </w:p>
           <w:p>
@@ -8693,12 +8081,6 @@
               <w:right w:val="nil"/>
             </w:tcBorders>
             <w:vAlign w:val="center"/>
-            <w:tcMar>
-              <w:top w:w="120" w:type="dxa"/>
-              <w:left w:w="160" w:type="dxa"/>
-              <w:bottom w:w="120" w:type="dxa"/>
-              <w:right w:w="160" w:type="dxa"/>
-            </w:tcMar>
           </w:tcPr>
           <w:p>
             <w:pPr>
@@ -8729,7 +8111,7 @@
                 <w:color w:val="2C2416"/>
                 <w:sz w:val="32"/>
               </w:rPr>
-              <w:t>现在该动。只动一点。</w:t>
+              <w:t>椅子比你懂。</w:t>
             </w:r>
           </w:p>
           <w:p>
@@ -8777,12 +8159,6 @@
               <w:right w:val="nil"/>
             </w:tcBorders>
             <w:vAlign w:val="center"/>
-            <w:tcMar>
-              <w:top w:w="120" w:type="dxa"/>
-              <w:left w:w="160" w:type="dxa"/>
-              <w:bottom w:w="120" w:type="dxa"/>
-              <w:right w:w="160" w:type="dxa"/>
-            </w:tcMar>
           </w:tcPr>
           <w:p>
             <w:pPr>
@@ -8813,7 +8189,7 @@
                 <w:color w:val="2C2416"/>
                 <w:sz w:val="32"/>
               </w:rPr>
-              <w:t>大动作留给大确定性。</w:t>
+              <w:t>刷新是一种迷信。</w:t>
             </w:r>
           </w:p>
           <w:p>
@@ -8861,12 +8237,6 @@
               <w:right w:val="nil"/>
             </w:tcBorders>
             <w:vAlign w:val="center"/>
-            <w:tcMar>
-              <w:top w:w="120" w:type="dxa"/>
-              <w:left w:w="160" w:type="dxa"/>
-              <w:bottom w:w="120" w:type="dxa"/>
-              <w:right w:w="160" w:type="dxa"/>
-            </w:tcMar>
           </w:tcPr>
           <w:p>
             <w:pPr>
@@ -8897,7 +8267,7 @@
                 <w:color w:val="2C2416"/>
                 <w:sz w:val="32"/>
               </w:rPr>
-              <w:t>你没有那么确定。</w:t>
+              <w:t>热闹是别人的。</w:t>
             </w:r>
           </w:p>
           <w:p>
@@ -8945,12 +8315,6 @@
               <w:right w:val="nil"/>
             </w:tcBorders>
             <w:vAlign w:val="center"/>
-            <w:tcMar>
-              <w:top w:w="120" w:type="dxa"/>
-              <w:left w:w="160" w:type="dxa"/>
-              <w:bottom w:w="120" w:type="dxa"/>
-              <w:right w:w="160" w:type="dxa"/>
-            </w:tcMar>
           </w:tcPr>
           <w:p>
             <w:pPr>
@@ -8981,7 +8345,7 @@
                 <w:color w:val="2C2416"/>
                 <w:sz w:val="32"/>
               </w:rPr>
-              <w:t>确定性是事后才有的词。</w:t>
+              <w:t>梦里再说。</w:t>
             </w:r>
           </w:p>
           <w:p>
@@ -9029,12 +8393,6 @@
               <w:right w:val="nil"/>
             </w:tcBorders>
             <w:vAlign w:val="center"/>
-            <w:tcMar>
-              <w:top w:w="120" w:type="dxa"/>
-              <w:left w:w="160" w:type="dxa"/>
-              <w:bottom w:w="120" w:type="dxa"/>
-              <w:right w:w="160" w:type="dxa"/>
-            </w:tcMar>
           </w:tcPr>
           <w:p>
             <w:pPr>
@@ -9065,7 +8423,7 @@
                 <w:color w:val="2C2416"/>
                 <w:sz w:val="32"/>
               </w:rPr>
-              <w:t>事前只有概率。</w:t>
+              <w:t>算了。真的算了。</w:t>
             </w:r>
           </w:p>
           <w:p>
@@ -9113,12 +8471,6 @@
               <w:right w:val="nil"/>
             </w:tcBorders>
             <w:vAlign w:val="center"/>
-            <w:tcMar>
-              <w:top w:w="120" w:type="dxa"/>
-              <w:left w:w="160" w:type="dxa"/>
-              <w:bottom w:w="120" w:type="dxa"/>
-              <w:right w:w="160" w:type="dxa"/>
-            </w:tcMar>
           </w:tcPr>
           <w:p>
             <w:pPr>
@@ -9149,7 +8501,7 @@
                 <w:color w:val="2C2416"/>
                 <w:sz w:val="32"/>
               </w:rPr>
-              <w:t>概率不保证这一次。</w:t>
+              <w:t>下课。</w:t>
             </w:r>
           </w:p>
           <w:p>
@@ -9197,12 +8549,6 @@
               <w:right w:val="nil"/>
             </w:tcBorders>
             <w:vAlign w:val="center"/>
-            <w:tcMar>
-              <w:top w:w="120" w:type="dxa"/>
-              <w:left w:w="160" w:type="dxa"/>
-              <w:bottom w:w="120" w:type="dxa"/>
-              <w:right w:w="160" w:type="dxa"/>
-            </w:tcMar>
           </w:tcPr>
           <w:p>
             <w:pPr>
@@ -9233,7 +8579,7 @@
                 <w:color w:val="2C2416"/>
                 <w:sz w:val="32"/>
               </w:rPr>
-              <w:t>这一次也可以放弃。</w:t>
+              <w:t>分居一晚。</w:t>
             </w:r>
           </w:p>
           <w:p>
@@ -9281,12 +8627,6 @@
               <w:right w:val="nil"/>
             </w:tcBorders>
             <w:vAlign w:val="center"/>
-            <w:tcMar>
-              <w:top w:w="120" w:type="dxa"/>
-              <w:left w:w="160" w:type="dxa"/>
-              <w:bottom w:w="120" w:type="dxa"/>
-              <w:right w:w="160" w:type="dxa"/>
-            </w:tcMar>
           </w:tcPr>
           <w:p>
             <w:pPr>
@@ -9317,7 +8657,7 @@
                 <w:color w:val="2C2416"/>
                 <w:sz w:val="32"/>
               </w:rPr>
-              <w:t>放弃也是选择。</w:t>
+              <w:t>开门见山：不要。</w:t>
             </w:r>
           </w:p>
           <w:p>
@@ -9365,12 +8705,6 @@
               <w:right w:val="nil"/>
             </w:tcBorders>
             <w:vAlign w:val="center"/>
-            <w:tcMar>
-              <w:top w:w="120" w:type="dxa"/>
-              <w:left w:w="160" w:type="dxa"/>
-              <w:bottom w:w="120" w:type="dxa"/>
-              <w:right w:w="160" w:type="dxa"/>
-            </w:tcMar>
           </w:tcPr>
           <w:p>
             <w:pPr>
@@ -9401,7 +8735,7 @@
                 <w:color w:val="2C2416"/>
                 <w:sz w:val="32"/>
               </w:rPr>
-              <w:t>不是每笔都要参与。</w:t>
+              <w:t>开门见山：要。但明天。</w:t>
             </w:r>
           </w:p>
           <w:p>
@@ -9449,12 +8783,6 @@
               <w:right w:val="nil"/>
             </w:tcBorders>
             <w:vAlign w:val="center"/>
-            <w:tcMar>
-              <w:top w:w="120" w:type="dxa"/>
-              <w:left w:w="160" w:type="dxa"/>
-              <w:bottom w:w="120" w:type="dxa"/>
-              <w:right w:w="160" w:type="dxa"/>
-            </w:tcMar>
           </w:tcPr>
           <w:p>
             <w:pPr>
@@ -9485,7 +8813,7 @@
                 <w:color w:val="2C2416"/>
                 <w:sz w:val="32"/>
               </w:rPr>
-              <w:t>参与欲在替你下单。</w:t>
+              <w:t>今晚 A 股关门。</w:t>
             </w:r>
           </w:p>
           <w:p>
@@ -9533,12 +8861,6 @@
               <w:right w:val="nil"/>
             </w:tcBorders>
             <w:vAlign w:val="center"/>
-            <w:tcMar>
-              <w:top w:w="120" w:type="dxa"/>
-              <w:left w:w="160" w:type="dxa"/>
-              <w:bottom w:w="120" w:type="dxa"/>
-              <w:right w:w="160" w:type="dxa"/>
-            </w:tcMar>
           </w:tcPr>
           <w:p>
             <w:pPr>
@@ -9569,7 +8891,7 @@
                 <w:color w:val="2C2416"/>
                 <w:sz w:val="32"/>
               </w:rPr>
-              <w:t>把参与欲关掉。</w:t>
+              <w:t>龙虎榜没请你。</w:t>
             </w:r>
           </w:p>
           <w:p>
@@ -9617,12 +8939,6 @@
               <w:right w:val="nil"/>
             </w:tcBorders>
             <w:vAlign w:val="center"/>
-            <w:tcMar>
-              <w:top w:w="120" w:type="dxa"/>
-              <w:left w:w="160" w:type="dxa"/>
-              <w:bottom w:w="120" w:type="dxa"/>
-              <w:right w:w="160" w:type="dxa"/>
-            </w:tcMar>
           </w:tcPr>
           <w:p>
             <w:pPr>
@@ -9653,7 +8969,7 @@
                 <w:color w:val="2C2416"/>
                 <w:sz w:val="32"/>
               </w:rPr>
-              <w:t>市场会惩罚迫不及待的人。</w:t>
+              <w:t>故事讲完了。鼓掌。</w:t>
             </w:r>
           </w:p>
           <w:p>
@@ -9701,12 +9017,6 @@
               <w:right w:val="nil"/>
             </w:tcBorders>
             <w:vAlign w:val="center"/>
-            <w:tcMar>
-              <w:top w:w="120" w:type="dxa"/>
-              <w:left w:w="160" w:type="dxa"/>
-              <w:bottom w:w="120" w:type="dxa"/>
-              <w:right w:w="160" w:type="dxa"/>
-            </w:tcMar>
           </w:tcPr>
           <w:p>
             <w:pPr>
@@ -9737,7 +9047,7 @@
                 <w:color w:val="2C2416"/>
                 <w:sz w:val="32"/>
               </w:rPr>
-              <w:t>等不到的，本来就不属于你。</w:t>
+              <w:t>热点在请客。你不是宾客。</w:t>
             </w:r>
           </w:p>
           <w:p>
@@ -9785,12 +9095,6 @@
               <w:right w:val="nil"/>
             </w:tcBorders>
             <w:vAlign w:val="center"/>
-            <w:tcMar>
-              <w:top w:w="120" w:type="dxa"/>
-              <w:left w:w="160" w:type="dxa"/>
-              <w:bottom w:w="120" w:type="dxa"/>
-              <w:right w:w="160" w:type="dxa"/>
-            </w:tcMar>
           </w:tcPr>
           <w:p>
             <w:pPr>
@@ -9821,7 +9125,7 @@
                 <w:color w:val="2C2416"/>
                 <w:sz w:val="32"/>
               </w:rPr>
-              <w:t>属于你的，会再给你时间。</w:t>
+              <w:t>板子很忙。你很闲。正好。</w:t>
             </w:r>
           </w:p>
           <w:p>
@@ -9869,12 +9173,6 @@
               <w:right w:val="nil"/>
             </w:tcBorders>
             <w:vAlign w:val="center"/>
-            <w:tcMar>
-              <w:top w:w="120" w:type="dxa"/>
-              <w:left w:w="160" w:type="dxa"/>
-              <w:bottom w:w="120" w:type="dxa"/>
-              <w:right w:w="160" w:type="dxa"/>
-            </w:tcMar>
           </w:tcPr>
           <w:p>
             <w:pPr>
@@ -9905,7 +9203,7 @@
                 <w:color w:val="2C2416"/>
                 <w:sz w:val="32"/>
               </w:rPr>
-              <w:t>时间站在有现金的人这边。</w:t>
+              <w:t>跌停板不约。</w:t>
             </w:r>
           </w:p>
           <w:p>
@@ -9953,12 +9251,6 @@
               <w:right w:val="nil"/>
             </w:tcBorders>
             <w:vAlign w:val="center"/>
-            <w:tcMar>
-              <w:top w:w="120" w:type="dxa"/>
-              <w:left w:w="160" w:type="dxa"/>
-              <w:bottom w:w="120" w:type="dxa"/>
-              <w:right w:w="160" w:type="dxa"/>
-            </w:tcMar>
           </w:tcPr>
           <w:p>
             <w:pPr>
@@ -9989,7 +9281,7 @@
                 <w:color w:val="2C2416"/>
                 <w:sz w:val="32"/>
               </w:rPr>
-              <w:t>杠杆把时间变成敌人。</w:t>
+              <w:t>红绿在吵架。你出去。</w:t>
             </w:r>
           </w:p>
           <w:p>
@@ -10037,12 +9329,6 @@
               <w:right w:val="nil"/>
             </w:tcBorders>
             <w:vAlign w:val="center"/>
-            <w:tcMar>
-              <w:top w:w="120" w:type="dxa"/>
-              <w:left w:w="160" w:type="dxa"/>
-              <w:bottom w:w="120" w:type="dxa"/>
-              <w:right w:w="160" w:type="dxa"/>
-            </w:tcMar>
           </w:tcPr>
           <w:p>
             <w:pPr>
@@ -10073,7 +9359,7 @@
                 <w:color w:val="2C2416"/>
                 <w:sz w:val="32"/>
               </w:rPr>
-              <w:t>不要借来勇气。</w:t>
+              <w:t>半只脚。收回来。</w:t>
             </w:r>
           </w:p>
           <w:p>
@@ -10121,12 +9407,6 @@
               <w:right w:val="nil"/>
             </w:tcBorders>
             <w:vAlign w:val="center"/>
-            <w:tcMar>
-              <w:top w:w="120" w:type="dxa"/>
-              <w:left w:w="160" w:type="dxa"/>
-              <w:bottom w:w="120" w:type="dxa"/>
-              <w:right w:w="160" w:type="dxa"/>
-            </w:tcMar>
           </w:tcPr>
           <w:p>
             <w:pPr>
@@ -10157,7 +9437,7 @@
                 <w:color w:val="2C2416"/>
                 <w:sz w:val="32"/>
               </w:rPr>
-              <w:t>融资是放大，也是倒计时。</w:t>
+              <w:t>全进去。太热情了。</w:t>
             </w:r>
           </w:p>
           <w:p>
@@ -10205,12 +9485,6 @@
               <w:right w:val="nil"/>
             </w:tcBorders>
             <w:vAlign w:val="center"/>
-            <w:tcMar>
-              <w:top w:w="120" w:type="dxa"/>
-              <w:left w:w="160" w:type="dxa"/>
-              <w:bottom w:w="120" w:type="dxa"/>
-              <w:right w:w="160" w:type="dxa"/>
-            </w:tcMar>
           </w:tcPr>
           <w:p>
             <w:pPr>
@@ -10241,7 +9515,7 @@
                 <w:color w:val="2C2416"/>
                 <w:sz w:val="32"/>
               </w:rPr>
-              <w:t>用自己的钱，听自己的心跳。</w:t>
+              <w:t>热情今晚打烊。</w:t>
             </w:r>
           </w:p>
           <w:p>
@@ -10289,12 +9563,6 @@
               <w:right w:val="nil"/>
             </w:tcBorders>
             <w:vAlign w:val="center"/>
-            <w:tcMar>
-              <w:top w:w="120" w:type="dxa"/>
-              <w:left w:w="160" w:type="dxa"/>
-              <w:bottom w:w="120" w:type="dxa"/>
-              <w:right w:w="160" w:type="dxa"/>
-            </w:tcMar>
           </w:tcPr>
           <w:p>
             <w:pPr>
@@ -10325,7 +9593,7 @@
                 <w:color w:val="2C2416"/>
                 <w:sz w:val="32"/>
               </w:rPr>
-              <w:t>心跳太快，就减仓。</w:t>
+              <w:t>购物车再躺一天。</w:t>
             </w:r>
           </w:p>
           <w:p>
@@ -10373,12 +9641,6 @@
               <w:right w:val="nil"/>
             </w:tcBorders>
             <w:vAlign w:val="center"/>
-            <w:tcMar>
-              <w:top w:w="120" w:type="dxa"/>
-              <w:left w:w="160" w:type="dxa"/>
-              <w:bottom w:w="120" w:type="dxa"/>
-              <w:right w:w="160" w:type="dxa"/>
-            </w:tcMar>
           </w:tcPr>
           <w:p>
             <w:pPr>
@@ -10409,7 +9671,7 @@
                 <w:color w:val="2C2416"/>
                 <w:sz w:val="32"/>
               </w:rPr>
-              <w:t>手心出汗，就离场。</w:t>
+              <w:t>有鸟。看鸟。</w:t>
             </w:r>
           </w:p>
           <w:p>
@@ -10457,12 +9719,6 @@
               <w:right w:val="nil"/>
             </w:tcBorders>
             <w:vAlign w:val="center"/>
-            <w:tcMar>
-              <w:top w:w="120" w:type="dxa"/>
-              <w:left w:w="160" w:type="dxa"/>
-              <w:bottom w:w="120" w:type="dxa"/>
-              <w:right w:w="160" w:type="dxa"/>
-            </w:tcMar>
           </w:tcPr>
           <w:p>
             <w:pPr>
@@ -10493,7 +9749,7 @@
                 <w:color w:val="2C2416"/>
                 <w:sz w:val="32"/>
               </w:rPr>
-              <w:t>身体比 K 线诚实。</w:t>
+              <w:t>七天无理由。你有理由。</w:t>
             </w:r>
           </w:p>
           <w:p>
@@ -10541,12 +9797,6 @@
               <w:right w:val="nil"/>
             </w:tcBorders>
             <w:vAlign w:val="center"/>
-            <w:tcMar>
-              <w:top w:w="120" w:type="dxa"/>
-              <w:left w:w="160" w:type="dxa"/>
-              <w:bottom w:w="120" w:type="dxa"/>
-              <w:right w:w="160" w:type="dxa"/>
-            </w:tcMar>
           </w:tcPr>
           <w:p>
             <w:pPr>
@@ -10577,7 +9827,7 @@
                 <w:color w:val="2C2416"/>
                 <w:sz w:val="32"/>
               </w:rPr>
-              <w:t>直觉在说什么？</w:t>
+              <w:t>无理由。更要退。</w:t>
             </w:r>
           </w:p>
           <w:p>
@@ -10625,12 +9875,6 @@
               <w:right w:val="nil"/>
             </w:tcBorders>
             <w:vAlign w:val="center"/>
-            <w:tcMar>
-              <w:top w:w="120" w:type="dxa"/>
-              <w:left w:w="160" w:type="dxa"/>
-              <w:bottom w:w="120" w:type="dxa"/>
-              <w:right w:w="160" w:type="dxa"/>
-            </w:tcMar>
           </w:tcPr>
           <w:p>
             <w:pPr>
@@ -10661,7 +9905,7 @@
                 <w:color w:val="2C2416"/>
                 <w:sz w:val="32"/>
               </w:rPr>
-              <w:t>直觉不是冲动。</w:t>
+              <w:t>晚饭叫你呢。</w:t>
             </w:r>
           </w:p>
           <w:p>
@@ -10709,12 +9953,6 @@
               <w:right w:val="nil"/>
             </w:tcBorders>
             <w:vAlign w:val="center"/>
-            <w:tcMar>
-              <w:top w:w="120" w:type="dxa"/>
-              <w:left w:w="160" w:type="dxa"/>
-              <w:bottom w:w="120" w:type="dxa"/>
-              <w:right w:w="160" w:type="dxa"/>
-            </w:tcMar>
           </w:tcPr>
           <w:p>
             <w:pPr>
@@ -10745,7 +9983,7 @@
                 <w:color w:val="2C2416"/>
                 <w:sz w:val="32"/>
               </w:rPr>
-              <w:t>冲动来得很快。</w:t>
+              <w:t>别让米饭等涨停。</w:t>
             </w:r>
           </w:p>
           <w:p>
@@ -10793,12 +10031,6 @@
               <w:right w:val="nil"/>
             </w:tcBorders>
             <w:vAlign w:val="center"/>
-            <w:tcMar>
-              <w:top w:w="120" w:type="dxa"/>
-              <w:left w:w="160" w:type="dxa"/>
-              <w:bottom w:w="120" w:type="dxa"/>
-              <w:right w:w="160" w:type="dxa"/>
-            </w:tcMar>
           </w:tcPr>
           <w:p>
             <w:pPr>
@@ -10829,7 +10061,7 @@
                 <w:color w:val="2C2416"/>
                 <w:sz w:val="32"/>
               </w:rPr>
-              <w:t>让冲动过一夜。</w:t>
+              <w:t>F5 退休了。</w:t>
             </w:r>
           </w:p>
           <w:p>
@@ -10877,12 +10109,6 @@
               <w:right w:val="nil"/>
             </w:tcBorders>
             <w:vAlign w:val="center"/>
-            <w:tcMar>
-              <w:top w:w="120" w:type="dxa"/>
-              <w:left w:w="160" w:type="dxa"/>
-              <w:bottom w:w="120" w:type="dxa"/>
-              <w:right w:w="160" w:type="dxa"/>
-            </w:tcMar>
           </w:tcPr>
           <w:p>
             <w:pPr>
@@ -10913,7 +10139,7 @@
                 <w:color w:val="2C2416"/>
                 <w:sz w:val="32"/>
               </w:rPr>
-              <w:t>过一夜再看，还在吗？</w:t>
+              <w:t>Esc。</w:t>
             </w:r>
           </w:p>
           <w:p>
@@ -10961,12 +10187,6 @@
               <w:right w:val="nil"/>
             </w:tcBorders>
             <w:vAlign w:val="center"/>
-            <w:tcMar>
-              <w:top w:w="120" w:type="dxa"/>
-              <w:left w:w="160" w:type="dxa"/>
-              <w:bottom w:w="120" w:type="dxa"/>
-              <w:right w:w="160" w:type="dxa"/>
-            </w:tcMar>
           </w:tcPr>
           <w:p>
             <w:pPr>
@@ -10997,7 +10217,7 @@
                 <w:color w:val="2C2416"/>
                 <w:sz w:val="32"/>
               </w:rPr>
-              <w:t>还在，才谈得上行动。</w:t>
+              <w:t>Ctrl+Z。</w:t>
             </w:r>
           </w:p>
           <w:p>
@@ -11045,12 +10265,6 @@
               <w:right w:val="nil"/>
             </w:tcBorders>
             <w:vAlign w:val="center"/>
-            <w:tcMar>
-              <w:top w:w="120" w:type="dxa"/>
-              <w:left w:w="160" w:type="dxa"/>
-              <w:bottom w:w="120" w:type="dxa"/>
-              <w:right w:w="160" w:type="dxa"/>
-            </w:tcMar>
           </w:tcPr>
           <w:p>
             <w:pPr>
@@ -11081,7 +10295,7 @@
                 <w:color w:val="2C2416"/>
                 <w:sz w:val="32"/>
               </w:rPr>
-              <w:t>不在了，说明那是天气。</w:t>
+              <w:t>保存。然后走开。</w:t>
             </w:r>
           </w:p>
           <w:p>
@@ -11129,12 +10343,6 @@
               <w:right w:val="nil"/>
             </w:tcBorders>
             <w:vAlign w:val="center"/>
-            <w:tcMar>
-              <w:top w:w="120" w:type="dxa"/>
-              <w:left w:w="160" w:type="dxa"/>
-              <w:bottom w:w="120" w:type="dxa"/>
-              <w:right w:w="160" w:type="dxa"/>
-            </w:tcMar>
           </w:tcPr>
           <w:p>
             <w:pPr>
@@ -11165,7 +10373,7 @@
                 <w:color w:val="2C2416"/>
                 <w:sz w:val="32"/>
               </w:rPr>
-              <w:t>别和天气对赌。</w:t>
+              <w:t>发送失败。幸亏。</w:t>
             </w:r>
           </w:p>
           <w:p>
@@ -11213,12 +10421,6 @@
               <w:right w:val="nil"/>
             </w:tcBorders>
             <w:vAlign w:val="center"/>
-            <w:tcMar>
-              <w:top w:w="120" w:type="dxa"/>
-              <w:left w:w="160" w:type="dxa"/>
-              <w:bottom w:w="120" w:type="dxa"/>
-              <w:right w:w="160" w:type="dxa"/>
-            </w:tcMar>
           </w:tcPr>
           <w:p>
             <w:pPr>
@@ -11249,7 +10451,7 @@
                 <w:color w:val="2C2416"/>
                 <w:sz w:val="32"/>
               </w:rPr>
-              <w:t>趋势是气候，不是今天的风。</w:t>
+              <w:t>对方已拒绝。</w:t>
             </w:r>
           </w:p>
           <w:p>
@@ -11297,12 +10499,6 @@
               <w:right w:val="nil"/>
             </w:tcBorders>
             <w:vAlign w:val="center"/>
-            <w:tcMar>
-              <w:top w:w="120" w:type="dxa"/>
-              <w:left w:w="160" w:type="dxa"/>
-              <w:bottom w:w="120" w:type="dxa"/>
-              <w:right w:w="160" w:type="dxa"/>
-            </w:tcMar>
           </w:tcPr>
           <w:p>
             <w:pPr>
@@ -11333,7 +10529,7 @@
                 <w:color w:val="2C2416"/>
                 <w:sz w:val="32"/>
               </w:rPr>
-              <w:t>今天的风，会停。</w:t>
+              <w:t>性格不合。分手。</w:t>
             </w:r>
           </w:p>
           <w:p>
@@ -11381,12 +10577,6 @@
               <w:right w:val="nil"/>
             </w:tcBorders>
             <w:vAlign w:val="center"/>
-            <w:tcMar>
-              <w:top w:w="120" w:type="dxa"/>
-              <w:left w:w="160" w:type="dxa"/>
-              <w:bottom w:w="120" w:type="dxa"/>
-              <w:right w:w="160" w:type="dxa"/>
-            </w:tcMar>
           </w:tcPr>
           <w:p>
             <w:pPr>
@@ -11417,7 +10607,7 @@
                 <w:color w:val="2C2416"/>
                 <w:sz w:val="32"/>
               </w:rPr>
-              <w:t>气候转变，你不会第一天知道。</w:t>
+              <w:t>复合？下次再说。</w:t>
             </w:r>
           </w:p>
           <w:p>
@@ -11465,12 +10655,6 @@
               <w:right w:val="nil"/>
             </w:tcBorders>
             <w:vAlign w:val="center"/>
-            <w:tcMar>
-              <w:top w:w="120" w:type="dxa"/>
-              <w:left w:w="160" w:type="dxa"/>
-              <w:bottom w:w="120" w:type="dxa"/>
-              <w:right w:w="160" w:type="dxa"/>
-            </w:tcMar>
           </w:tcPr>
           <w:p>
             <w:pPr>
@@ -11501,7 +10685,7 @@
                 <w:color w:val="2C2416"/>
                 <w:sz w:val="32"/>
               </w:rPr>
-              <w:t>所以要留退路。</w:t>
+              <w:t>别把电视剧当纪录片。</w:t>
             </w:r>
           </w:p>
           <w:p>
@@ -11549,12 +10733,6 @@
               <w:right w:val="nil"/>
             </w:tcBorders>
             <w:vAlign w:val="center"/>
-            <w:tcMar>
-              <w:top w:w="120" w:type="dxa"/>
-              <w:left w:w="160" w:type="dxa"/>
-              <w:bottom w:w="120" w:type="dxa"/>
-              <w:right w:w="160" w:type="dxa"/>
-            </w:tcMar>
           </w:tcPr>
           <w:p>
             <w:pPr>
@@ -11585,7 +10763,7 @@
                 <w:color w:val="2C2416"/>
                 <w:sz w:val="32"/>
               </w:rPr>
-              <w:t>退路不是悲观。</w:t>
+              <w:t>别把群聊当新闻。</w:t>
             </w:r>
           </w:p>
           <w:p>
@@ -11633,12 +10811,6 @@
               <w:right w:val="nil"/>
             </w:tcBorders>
             <w:vAlign w:val="center"/>
-            <w:tcMar>
-              <w:top w:w="120" w:type="dxa"/>
-              <w:left w:w="160" w:type="dxa"/>
-              <w:bottom w:w="120" w:type="dxa"/>
-              <w:right w:w="160" w:type="dxa"/>
-            </w:tcMar>
           </w:tcPr>
           <w:p>
             <w:pPr>
@@ -11669,7 +10841,7 @@
                 <w:color w:val="2C2416"/>
                 <w:sz w:val="32"/>
               </w:rPr>
-              <w:t>退路是成年人的标配。</w:t>
+              <w:t>账户想静静。</w:t>
             </w:r>
           </w:p>
           <w:p>
@@ -11717,12 +10889,6 @@
               <w:right w:val="nil"/>
             </w:tcBorders>
             <w:vAlign w:val="center"/>
-            <w:tcMar>
-              <w:top w:w="120" w:type="dxa"/>
-              <w:left w:w="160" w:type="dxa"/>
-              <w:bottom w:w="120" w:type="dxa"/>
-              <w:right w:w="160" w:type="dxa"/>
-            </w:tcMar>
           </w:tcPr>
           <w:p>
             <w:pPr>
@@ -11753,7 +10919,7 @@
                 <w:color w:val="2C2416"/>
                 <w:sz w:val="32"/>
               </w:rPr>
-              <w:t>设好再进。</w:t>
+              <w:t>静音。</w:t>
             </w:r>
           </w:p>
           <w:p>
@@ -11801,12 +10967,6 @@
               <w:right w:val="nil"/>
             </w:tcBorders>
             <w:vAlign w:val="center"/>
-            <w:tcMar>
-              <w:top w:w="120" w:type="dxa"/>
-              <w:left w:w="160" w:type="dxa"/>
-              <w:bottom w:w="120" w:type="dxa"/>
-              <w:right w:w="160" w:type="dxa"/>
-            </w:tcMar>
           </w:tcPr>
           <w:p>
             <w:pPr>
@@ -11837,7 +10997,7 @@
                 <w:color w:val="2C2416"/>
                 <w:sz w:val="32"/>
               </w:rPr>
-              <w:t>没设边，就还没开始。</w:t>
+              <w:t>勿扰模式：开。</w:t>
             </w:r>
           </w:p>
           <w:p>
@@ -11885,12 +11045,6 @@
               <w:right w:val="nil"/>
             </w:tcBorders>
             <w:vAlign w:val="center"/>
-            <w:tcMar>
-              <w:top w:w="120" w:type="dxa"/>
-              <w:left w:w="160" w:type="dxa"/>
-              <w:bottom w:w="120" w:type="dxa"/>
-              <w:right w:w="160" w:type="dxa"/>
-            </w:tcMar>
           </w:tcPr>
           <w:p>
             <w:pPr>
@@ -11921,7 +11075,7 @@
                 <w:color w:val="2C2416"/>
                 <w:sz w:val="32"/>
               </w:rPr>
-              <w:t>先写下来。</w:t>
+              <w:t>9:30 是别人的战争。</w:t>
             </w:r>
           </w:p>
           <w:p>
@@ -11969,12 +11123,6 @@
               <w:right w:val="nil"/>
             </w:tcBorders>
             <w:vAlign w:val="center"/>
-            <w:tcMar>
-              <w:top w:w="120" w:type="dxa"/>
-              <w:left w:w="160" w:type="dxa"/>
-              <w:bottom w:w="120" w:type="dxa"/>
-              <w:right w:w="160" w:type="dxa"/>
-            </w:tcMar>
           </w:tcPr>
           <w:p>
             <w:pPr>
@@ -12005,7 +11153,7 @@
                 <w:color w:val="2C2416"/>
                 <w:sz w:val="32"/>
               </w:rPr>
-              <w:t>跌的时候你会找借口。</w:t>
+              <w:t>预告片经常骗人。</w:t>
             </w:r>
           </w:p>
           <w:p>
@@ -12053,12 +11201,6 @@
               <w:right w:val="nil"/>
             </w:tcBorders>
             <w:vAlign w:val="center"/>
-            <w:tcMar>
-              <w:top w:w="120" w:type="dxa"/>
-              <w:left w:w="160" w:type="dxa"/>
-              <w:bottom w:w="120" w:type="dxa"/>
-              <w:right w:w="160" w:type="dxa"/>
-            </w:tcMar>
           </w:tcPr>
           <w:p>
             <w:pPr>
@@ -12089,7 +11231,7 @@
                 <w:color w:val="2C2416"/>
                 <w:sz w:val="32"/>
               </w:rPr>
-              <w:t>借口已经准备好了。别用。</w:t>
+              <w:t>导演没请你。</w:t>
             </w:r>
           </w:p>
           <w:p>
@@ -12137,12 +11279,6 @@
               <w:right w:val="nil"/>
             </w:tcBorders>
             <w:vAlign w:val="center"/>
-            <w:tcMar>
-              <w:top w:w="120" w:type="dxa"/>
-              <w:left w:w="160" w:type="dxa"/>
-              <w:bottom w:w="120" w:type="dxa"/>
-              <w:right w:w="160" w:type="dxa"/>
-            </w:tcMar>
           </w:tcPr>
           <w:p>
             <w:pPr>
@@ -12173,7 +11309,7 @@
                 <w:color w:val="2C2416"/>
                 <w:sz w:val="32"/>
               </w:rPr>
-              <w:t>承认看错，只需要一秒钟。</w:t>
+              <w:t>群演也不要当。</w:t>
             </w:r>
           </w:p>
           <w:p>
@@ -12221,12 +11357,6 @@
               <w:right w:val="nil"/>
             </w:tcBorders>
             <w:vAlign w:val="center"/>
-            <w:tcMar>
-              <w:top w:w="120" w:type="dxa"/>
-              <w:left w:w="160" w:type="dxa"/>
-              <w:bottom w:w="120" w:type="dxa"/>
-              <w:right w:w="160" w:type="dxa"/>
-            </w:tcMar>
           </w:tcPr>
           <w:p>
             <w:pPr>
@@ -12257,7 +11387,7 @@
                 <w:color w:val="2C2416"/>
                 <w:sz w:val="32"/>
               </w:rPr>
-              <w:t>这一秒最贵。</w:t>
+              <w:t>票买贵了。退。</w:t>
             </w:r>
           </w:p>
           <w:p>
@@ -12305,12 +11435,6 @@
               <w:right w:val="nil"/>
             </w:tcBorders>
             <w:vAlign w:val="center"/>
-            <w:tcMar>
-              <w:top w:w="120" w:type="dxa"/>
-              <w:left w:w="160" w:type="dxa"/>
-              <w:bottom w:w="120" w:type="dxa"/>
-              <w:right w:w="160" w:type="dxa"/>
-            </w:tcMar>
           </w:tcPr>
           <w:p>
             <w:pPr>
@@ -12341,7 +11465,7 @@
                 <w:color w:val="2C2416"/>
                 <w:sz w:val="32"/>
               </w:rPr>
-              <w:t>贵也要付。</w:t>
+              <w:t>谢幕。</w:t>
             </w:r>
           </w:p>
           <w:p>
@@ -12389,12 +11513,6 @@
               <w:right w:val="nil"/>
             </w:tcBorders>
             <w:vAlign w:val="center"/>
-            <w:tcMar>
-              <w:top w:w="120" w:type="dxa"/>
-              <w:left w:w="160" w:type="dxa"/>
-              <w:bottom w:w="120" w:type="dxa"/>
-              <w:right w:w="160" w:type="dxa"/>
-            </w:tcMar>
           </w:tcPr>
           <w:p>
             <w:pPr>
@@ -12425,7 +11543,7 @@
                 <w:color w:val="2C2416"/>
                 <w:sz w:val="32"/>
               </w:rPr>
-              <w:t>止损是门票的一部分。</w:t>
+              <w:t>灯亮了。该走了。</w:t>
             </w:r>
           </w:p>
           <w:p>
@@ -12473,12 +11591,6 @@
               <w:right w:val="nil"/>
             </w:tcBorders>
             <w:vAlign w:val="center"/>
-            <w:tcMar>
-              <w:top w:w="120" w:type="dxa"/>
-              <w:left w:w="160" w:type="dxa"/>
-              <w:bottom w:w="120" w:type="dxa"/>
-              <w:right w:w="160" w:type="dxa"/>
-            </w:tcMar>
           </w:tcPr>
           <w:p>
             <w:pPr>
@@ -12509,7 +11621,7 @@
                 <w:color w:val="2C2416"/>
                 <w:sz w:val="32"/>
               </w:rPr>
-              <w:t>止盈是礼貌。</w:t>
+              <w:t>出口在右边。</w:t>
             </w:r>
           </w:p>
           <w:p>
@@ -12557,12 +11669,6 @@
               <w:right w:val="nil"/>
             </w:tcBorders>
             <w:vAlign w:val="center"/>
-            <w:tcMar>
-              <w:top w:w="120" w:type="dxa"/>
-              <w:left w:w="160" w:type="dxa"/>
-              <w:bottom w:w="120" w:type="dxa"/>
-              <w:right w:w="160" w:type="dxa"/>
-            </w:tcMar>
           </w:tcPr>
           <w:p>
             <w:pPr>
@@ -12593,7 +11699,7 @@
                 <w:color w:val="2C2416"/>
                 <w:sz w:val="32"/>
               </w:rPr>
-              <w:t>留一点给别人赚。</w:t>
+              <w:t>你在开玩笑吗？</w:t>
             </w:r>
           </w:p>
           <w:p>
@@ -12641,12 +11747,6 @@
               <w:right w:val="nil"/>
             </w:tcBorders>
             <w:vAlign w:val="center"/>
-            <w:tcMar>
-              <w:top w:w="120" w:type="dxa"/>
-              <w:left w:w="160" w:type="dxa"/>
-              <w:bottom w:w="120" w:type="dxa"/>
-              <w:right w:w="160" w:type="dxa"/>
-            </w:tcMar>
           </w:tcPr>
           <w:p>
             <w:pPr>
@@ -12677,7 +11777,7 @@
                 <w:color w:val="2C2416"/>
                 <w:sz w:val="32"/>
               </w:rPr>
-              <w:t>你不必赚完。</w:t>
+              <w:t>这会很有趣。对别人。</w:t>
             </w:r>
           </w:p>
           <w:p>
@@ -12725,12 +11825,6 @@
               <w:right w:val="nil"/>
             </w:tcBorders>
             <w:vAlign w:val="center"/>
-            <w:tcMar>
-              <w:top w:w="120" w:type="dxa"/>
-              <w:left w:w="160" w:type="dxa"/>
-              <w:bottom w:w="120" w:type="dxa"/>
-              <w:right w:w="160" w:type="dxa"/>
-            </w:tcMar>
           </w:tcPr>
           <w:p>
             <w:pPr>
@@ -12761,7 +11855,7 @@
                 <w:color w:val="2C2416"/>
                 <w:sz w:val="32"/>
               </w:rPr>
-              <w:t>贪的是最后一段。</w:t>
+              <w:t>别告诉同事。</w:t>
             </w:r>
           </w:p>
           <w:p>
@@ -12809,12 +11903,6 @@
               <w:right w:val="nil"/>
             </w:tcBorders>
             <w:vAlign w:val="center"/>
-            <w:tcMar>
-              <w:top w:w="120" w:type="dxa"/>
-              <w:left w:w="160" w:type="dxa"/>
-              <w:bottom w:w="120" w:type="dxa"/>
-              <w:right w:w="160" w:type="dxa"/>
-            </w:tcMar>
           </w:tcPr>
           <w:p>
             <w:pPr>
@@ -12845,7 +11933,7 @@
                 <w:color w:val="2C2416"/>
                 <w:sz w:val="32"/>
               </w:rPr>
-              <w:t>最后一段最贵。</w:t>
+              <w:t>再等一个星期。周很随便。</w:t>
             </w:r>
           </w:p>
           <w:p>
@@ -12893,12 +11981,6 @@
               <w:right w:val="nil"/>
             </w:tcBorders>
             <w:vAlign w:val="center"/>
-            <w:tcMar>
-              <w:top w:w="120" w:type="dxa"/>
-              <w:left w:w="160" w:type="dxa"/>
-              <w:bottom w:w="120" w:type="dxa"/>
-              <w:right w:w="160" w:type="dxa"/>
-            </w:tcMar>
           </w:tcPr>
           <w:p>
             <w:pPr>
@@ -12929,7 +12011,7 @@
                 <w:color w:val="2C2416"/>
                 <w:sz w:val="32"/>
               </w:rPr>
-              <w:t>见好就收，不是胆小。</w:t>
+              <w:t>把这当成一次散步。</w:t>
             </w:r>
           </w:p>
           <w:p>
@@ -12977,12 +12059,6 @@
               <w:right w:val="nil"/>
             </w:tcBorders>
             <w:vAlign w:val="center"/>
-            <w:tcMar>
-              <w:top w:w="120" w:type="dxa"/>
-              <w:left w:w="160" w:type="dxa"/>
-              <w:bottom w:w="120" w:type="dxa"/>
-              <w:right w:w="160" w:type="dxa"/>
-            </w:tcMar>
           </w:tcPr>
           <w:p>
             <w:pPr>
@@ -13013,7 +12089,7 @@
                 <w:color w:val="2C2416"/>
                 <w:sz w:val="32"/>
               </w:rPr>
-              <w:t>胆小有时是一种仓位。</w:t>
+              <w:t>值得等待。也可以不。</w:t>
             </w:r>
           </w:p>
           <w:p>
@@ -13061,12 +12137,6 @@
               <w:right w:val="nil"/>
             </w:tcBorders>
             <w:vAlign w:val="center"/>
-            <w:tcMar>
-              <w:top w:w="120" w:type="dxa"/>
-              <w:left w:w="160" w:type="dxa"/>
-              <w:bottom w:w="120" w:type="dxa"/>
-              <w:right w:w="160" w:type="dxa"/>
-            </w:tcMar>
           </w:tcPr>
           <w:p>
             <w:pPr>
@@ -13097,7 +12167,7 @@
                 <w:color w:val="2C2416"/>
                 <w:sz w:val="32"/>
               </w:rPr>
-              <w:t>胆大要配得起规则。</w:t>
+              <w:t>小心。主要是小心自己。</w:t>
             </w:r>
           </w:p>
           <w:p>
@@ -13145,12 +12215,6 @@
               <w:right w:val="nil"/>
             </w:tcBorders>
             <w:vAlign w:val="center"/>
-            <w:tcMar>
-              <w:top w:w="120" w:type="dxa"/>
-              <w:left w:w="160" w:type="dxa"/>
-              <w:bottom w:w="120" w:type="dxa"/>
-              <w:right w:w="160" w:type="dxa"/>
-            </w:tcMar>
           </w:tcPr>
           <w:p>
             <w:pPr>
@@ -13181,7 +12245,7 @@
                 <w:color w:val="2C2416"/>
                 <w:sz w:val="32"/>
               </w:rPr>
-              <w:t>规则比信心可靠。</w:t>
+              <w:t>金钱会解决这个问题吗？</w:t>
             </w:r>
           </w:p>
           <w:p>
@@ -13229,12 +12293,6 @@
               <w:right w:val="nil"/>
             </w:tcBorders>
             <w:vAlign w:val="center"/>
-            <w:tcMar>
-              <w:top w:w="120" w:type="dxa"/>
-              <w:left w:w="160" w:type="dxa"/>
-              <w:bottom w:w="120" w:type="dxa"/>
-              <w:right w:w="160" w:type="dxa"/>
-            </w:tcMar>
           </w:tcPr>
           <w:p>
             <w:pPr>
@@ -13265,7 +12323,7 @@
                 <w:color w:val="2C2416"/>
                 <w:sz w:val="32"/>
               </w:rPr>
-              <w:t>信心会过期。</w:t>
+              <w:t>现在就去？先找拖鞋。</w:t>
             </w:r>
           </w:p>
           <w:p>
@@ -13313,12 +12371,6 @@
               <w:right w:val="nil"/>
             </w:tcBorders>
             <w:vAlign w:val="center"/>
-            <w:tcMar>
-              <w:top w:w="120" w:type="dxa"/>
-              <w:left w:w="160" w:type="dxa"/>
-              <w:bottom w:w="120" w:type="dxa"/>
-              <w:right w:w="160" w:type="dxa"/>
-            </w:tcMar>
           </w:tcPr>
           <w:p>
             <w:pPr>
@@ -13349,7 +12401,7 @@
                 <w:color w:val="2C2416"/>
                 <w:sz w:val="32"/>
               </w:rPr>
-              <w:t>过期的信心叫固执。</w:t>
+              <w:t>全力以赴。去洗碗。</w:t>
             </w:r>
           </w:p>
           <w:p>
@@ -13397,12 +12449,6 @@
               <w:right w:val="nil"/>
             </w:tcBorders>
             <w:vAlign w:val="center"/>
-            <w:tcMar>
-              <w:top w:w="120" w:type="dxa"/>
-              <w:left w:w="160" w:type="dxa"/>
-              <w:bottom w:w="120" w:type="dxa"/>
-              <w:right w:w="160" w:type="dxa"/>
-            </w:tcMar>
           </w:tcPr>
           <w:p>
             <w:pPr>
@@ -13433,7 +12479,7 @@
                 <w:color w:val="2C2416"/>
                 <w:sz w:val="32"/>
               </w:rPr>
-              <w:t>你分得清固执和坚持吗？</w:t>
+              <w:t>保持开放。窗户那种。</w:t>
             </w:r>
           </w:p>
           <w:p>
@@ -13481,12 +12527,6 @@
               <w:right w:val="nil"/>
             </w:tcBorders>
             <w:vAlign w:val="center"/>
-            <w:tcMar>
-              <w:top w:w="120" w:type="dxa"/>
-              <w:left w:w="160" w:type="dxa"/>
-              <w:bottom w:w="120" w:type="dxa"/>
-              <w:right w:w="160" w:type="dxa"/>
-            </w:tcMar>
           </w:tcPr>
           <w:p>
             <w:pPr>
@@ -13517,7 +12557,7 @@
                 <w:color w:val="2C2416"/>
                 <w:sz w:val="32"/>
               </w:rPr>
-              <w:t>坚持有计划。固执只有成本。</w:t>
+              <w:t>跟随你的心。心说饿。</w:t>
             </w:r>
           </w:p>
           <w:p>
@@ -13565,12 +12605,6 @@
               <w:right w:val="nil"/>
             </w:tcBorders>
             <w:vAlign w:val="center"/>
-            <w:tcMar>
-              <w:top w:w="120" w:type="dxa"/>
-              <w:left w:w="160" w:type="dxa"/>
-              <w:bottom w:w="120" w:type="dxa"/>
-              <w:right w:w="160" w:type="dxa"/>
-            </w:tcMar>
           </w:tcPr>
           <w:p>
             <w:pPr>
@@ -13601,7 +12635,7 @@
                 <w:color w:val="2C2416"/>
                 <w:sz w:val="32"/>
               </w:rPr>
-              <w:t>放下这只。</w:t>
+              <w:t>换个角度。侧躺。</w:t>
             </w:r>
           </w:p>
           <w:p>
@@ -13649,12 +12683,6 @@
               <w:right w:val="nil"/>
             </w:tcBorders>
             <w:vAlign w:val="center"/>
-            <w:tcMar>
-              <w:top w:w="120" w:type="dxa"/>
-              <w:left w:w="160" w:type="dxa"/>
-              <w:bottom w:w="120" w:type="dxa"/>
-              <w:right w:w="160" w:type="dxa"/>
-            </w:tcMar>
           </w:tcPr>
           <w:p>
             <w:pPr>
@@ -13685,7 +12713,7 @@
                 <w:color w:val="2C2416"/>
                 <w:sz w:val="32"/>
               </w:rPr>
-              <w:t>再给它一点时间。</w:t>
+              <w:t>你需要的是休息。真的。</w:t>
             </w:r>
           </w:p>
           <w:p>
@@ -13733,12 +12761,6 @@
               <w:right w:val="nil"/>
             </w:tcBorders>
             <w:vAlign w:val="center"/>
-            <w:tcMar>
-              <w:top w:w="120" w:type="dxa"/>
-              <w:left w:w="160" w:type="dxa"/>
-              <w:bottom w:w="120" w:type="dxa"/>
-              <w:right w:w="160" w:type="dxa"/>
-            </w:tcMar>
           </w:tcPr>
           <w:p>
             <w:pPr>
@@ -13769,7 +12791,7 @@
                 <w:color w:val="2C2416"/>
                 <w:sz w:val="32"/>
               </w:rPr>
-              <w:t>时间不是用来摊平的。</w:t>
+              <w:t>问问最好的朋友。然后别听。</w:t>
             </w:r>
           </w:p>
           <w:p>
@@ -13817,12 +12839,6 @@
               <w:right w:val="nil"/>
             </w:tcBorders>
             <w:vAlign w:val="center"/>
-            <w:tcMar>
-              <w:top w:w="120" w:type="dxa"/>
-              <w:left w:w="160" w:type="dxa"/>
-              <w:bottom w:w="120" w:type="dxa"/>
-              <w:right w:w="160" w:type="dxa"/>
-            </w:tcMar>
           </w:tcPr>
           <w:p>
             <w:pPr>
@@ -13853,7 +12869,7 @@
                 <w:color w:val="2C2416"/>
                 <w:sz w:val="32"/>
               </w:rPr>
-              <w:t>时间是用来等待条件的。</w:t>
+              <w:t>不告诉任何人。包括群。</w:t>
             </w:r>
           </w:p>
           <w:p>
@@ -13901,12 +12917,6 @@
               <w:right w:val="nil"/>
             </w:tcBorders>
             <w:vAlign w:val="center"/>
-            <w:tcMar>
-              <w:top w:w="120" w:type="dxa"/>
-              <w:left w:w="160" w:type="dxa"/>
-              <w:bottom w:w="120" w:type="dxa"/>
-              <w:right w:w="160" w:type="dxa"/>
-            </w:tcMar>
           </w:tcPr>
           <w:p>
             <w:pPr>
@@ -13937,7 +12947,7 @@
                 <w:color w:val="2C2416"/>
                 <w:sz w:val="32"/>
               </w:rPr>
-              <w:t>条件还没到。</w:t>
+              <w:t>会很有趣。如果当玩笑。</w:t>
             </w:r>
           </w:p>
           <w:p>
@@ -13985,12 +12995,6 @@
               <w:right w:val="nil"/>
             </w:tcBorders>
             <w:vAlign w:val="center"/>
-            <w:tcMar>
-              <w:top w:w="120" w:type="dxa"/>
-              <w:left w:w="160" w:type="dxa"/>
-              <w:bottom w:w="120" w:type="dxa"/>
-              <w:right w:w="160" w:type="dxa"/>
-            </w:tcMar>
           </w:tcPr>
           <w:p>
             <w:pPr>
@@ -14021,7 +13025,7 @@
                 <w:color w:val="2C2416"/>
                 <w:sz w:val="32"/>
               </w:rPr>
-              <w:t>条件已经到了，你在犹豫。</w:t>
+              <w:t>这不关你的事。也可能关。</w:t>
             </w:r>
           </w:p>
           <w:p>
@@ -14069,12 +13073,6 @@
               <w:right w:val="nil"/>
             </w:tcBorders>
             <w:vAlign w:val="center"/>
-            <w:tcMar>
-              <w:top w:w="120" w:type="dxa"/>
-              <w:left w:w="160" w:type="dxa"/>
-              <w:bottom w:w="120" w:type="dxa"/>
-              <w:right w:w="160" w:type="dxa"/>
-            </w:tcMar>
           </w:tcPr>
           <w:p>
             <w:pPr>
@@ -14105,7 +13103,7 @@
                 <w:color w:val="2C2416"/>
                 <w:sz w:val="32"/>
               </w:rPr>
-              <w:t>犹豫的时候，选更小的仓。</w:t>
+              <w:t>月亮圆了也不管账户。</w:t>
             </w:r>
           </w:p>
           <w:p>
@@ -14153,12 +13151,6 @@
               <w:right w:val="nil"/>
             </w:tcBorders>
             <w:vAlign w:val="center"/>
-            <w:tcMar>
-              <w:top w:w="120" w:type="dxa"/>
-              <w:left w:w="160" w:type="dxa"/>
-              <w:bottom w:w="120" w:type="dxa"/>
-              <w:right w:w="160" w:type="dxa"/>
-            </w:tcMar>
           </w:tcPr>
           <w:p>
             <w:pPr>
@@ -14189,7 +13181,7 @@
                 <w:color w:val="2C2416"/>
                 <w:sz w:val="32"/>
               </w:rPr>
-              <w:t>犹豫的时候，也可以不选。</w:t>
+              <w:t>打烊。真的打烊。</w:t>
             </w:r>
           </w:p>
           <w:p>
@@ -14237,12 +13229,6 @@
               <w:right w:val="nil"/>
             </w:tcBorders>
             <w:vAlign w:val="center"/>
-            <w:tcMar>
-              <w:top w:w="120" w:type="dxa"/>
-              <w:left w:w="160" w:type="dxa"/>
-              <w:bottom w:w="120" w:type="dxa"/>
-              <w:right w:w="160" w:type="dxa"/>
-            </w:tcMar>
           </w:tcPr>
           <w:p>
             <w:pPr>
@@ -14273,7 +13259,7 @@
                 <w:color w:val="2C2416"/>
                 <w:sz w:val="32"/>
               </w:rPr>
-              <w:t>不选是合法的。</w:t>
+              <w:t>右手。</w:t>
             </w:r>
           </w:p>
           <w:p>
@@ -14321,12 +13307,6 @@
               <w:right w:val="nil"/>
             </w:tcBorders>
             <w:vAlign w:val="center"/>
-            <w:tcMar>
-              <w:top w:w="120" w:type="dxa"/>
-              <w:left w:w="160" w:type="dxa"/>
-              <w:bottom w:w="120" w:type="dxa"/>
-              <w:right w:w="160" w:type="dxa"/>
-            </w:tcMar>
           </w:tcPr>
           <w:p>
             <w:pPr>
@@ -14357,7 +13337,7 @@
                 <w:color w:val="2C2416"/>
                 <w:sz w:val="32"/>
               </w:rPr>
-              <w:t>空仓不会让你消失。</w:t>
+              <w:t>出门左转。</w:t>
             </w:r>
           </w:p>
           <w:p>
@@ -14405,12 +13385,6 @@
               <w:right w:val="nil"/>
             </w:tcBorders>
             <w:vAlign w:val="center"/>
-            <w:tcMar>
-              <w:top w:w="120" w:type="dxa"/>
-              <w:left w:w="160" w:type="dxa"/>
-              <w:bottom w:w="120" w:type="dxa"/>
-              <w:right w:w="160" w:type="dxa"/>
-            </w:tcMar>
           </w:tcPr>
           <w:p>
             <w:pPr>
@@ -14441,7 +13415,7 @@
                 <w:color w:val="2C2416"/>
                 <w:sz w:val="32"/>
               </w:rPr>
-              <w:t>账户还在。人还在。这就够。</w:t>
+              <w:t>绿色。</w:t>
             </w:r>
           </w:p>
           <w:p>
@@ -14489,12 +13463,6 @@
               <w:right w:val="nil"/>
             </w:tcBorders>
             <w:vAlign w:val="center"/>
-            <w:tcMar>
-              <w:top w:w="120" w:type="dxa"/>
-              <w:left w:w="160" w:type="dxa"/>
-              <w:bottom w:w="120" w:type="dxa"/>
-              <w:right w:w="160" w:type="dxa"/>
-            </w:tcMar>
           </w:tcPr>
           <w:p>
             <w:pPr>
@@ -14525,7 +13493,7 @@
                 <w:color w:val="2C2416"/>
                 <w:sz w:val="32"/>
               </w:rPr>
-              <w:t>活过这轮波动。</w:t>
+              <w:t>利空穿了件大衣。</w:t>
             </w:r>
           </w:p>
           <w:p>
@@ -14573,12 +13541,6 @@
               <w:right w:val="nil"/>
             </w:tcBorders>
             <w:vAlign w:val="center"/>
-            <w:tcMar>
-              <w:top w:w="120" w:type="dxa"/>
-              <w:left w:w="160" w:type="dxa"/>
-              <w:bottom w:w="120" w:type="dxa"/>
-              <w:right w:w="160" w:type="dxa"/>
-            </w:tcMar>
           </w:tcPr>
           <w:p>
             <w:pPr>
@@ -14609,7 +13571,7 @@
                 <w:color w:val="2C2416"/>
                 <w:sz w:val="32"/>
               </w:rPr>
-              <w:t>你在重复。</w:t>
+              <w:t>屏幕说：我累了。</w:t>
             </w:r>
           </w:p>
           <w:p>
@@ -14657,12 +13619,6 @@
               <w:right w:val="nil"/>
             </w:tcBorders>
             <w:vAlign w:val="center"/>
-            <w:tcMar>
-              <w:top w:w="120" w:type="dxa"/>
-              <w:left w:w="160" w:type="dxa"/>
-              <w:bottom w:w="120" w:type="dxa"/>
-              <w:right w:w="160" w:type="dxa"/>
-            </w:tcMar>
           </w:tcPr>
           <w:p>
             <w:pPr>
@@ -14693,7 +13649,7 @@
                 <w:color w:val="2C2416"/>
                 <w:sz w:val="32"/>
               </w:rPr>
-              <w:t>停下来。改一道手续。</w:t>
+              <w:t>隐身。</w:t>
             </w:r>
           </w:p>
           <w:p>
@@ -14741,12 +13697,6 @@
               <w:right w:val="nil"/>
             </w:tcBorders>
             <w:vAlign w:val="center"/>
-            <w:tcMar>
-              <w:top w:w="120" w:type="dxa"/>
-              <w:left w:w="160" w:type="dxa"/>
-              <w:bottom w:w="120" w:type="dxa"/>
-              <w:right w:w="160" w:type="dxa"/>
-            </w:tcMar>
           </w:tcPr>
           <w:p>
             <w:pPr>
@@ -14777,7 +13727,7 @@
                 <w:color w:val="2C2416"/>
                 <w:sz w:val="32"/>
               </w:rPr>
-              <w:t>看得越多，手越痒。</w:t>
+              <w:t>客服不在线。</w:t>
             </w:r>
           </w:p>
           <w:p>
@@ -14825,12 +13775,6 @@
               <w:right w:val="nil"/>
             </w:tcBorders>
             <w:vAlign w:val="center"/>
-            <w:tcMar>
-              <w:top w:w="120" w:type="dxa"/>
-              <w:left w:w="160" w:type="dxa"/>
-              <w:bottom w:w="120" w:type="dxa"/>
-              <w:right w:w="160" w:type="dxa"/>
-            </w:tcMar>
           </w:tcPr>
           <w:p>
             <w:pPr>
@@ -14861,7 +13805,7 @@
                 <w:color w:val="2C2416"/>
                 <w:sz w:val="32"/>
               </w:rPr>
-              <w:t>只留三只观察。</w:t>
+              <w:t>留言：算了。</w:t>
             </w:r>
           </w:p>
           <w:p>
@@ -14909,12 +13853,6 @@
               <w:right w:val="nil"/>
             </w:tcBorders>
             <w:vAlign w:val="center"/>
-            <w:tcMar>
-              <w:top w:w="120" w:type="dxa"/>
-              <w:left w:w="160" w:type="dxa"/>
-              <w:bottom w:w="120" w:type="dxa"/>
-              <w:right w:w="160" w:type="dxa"/>
-            </w:tcMar>
           </w:tcPr>
           <w:p>
             <w:pPr>
@@ -14945,7 +13883,7 @@
                 <w:color w:val="2C2416"/>
                 <w:sz w:val="32"/>
               </w:rPr>
-              <w:t>三只已经够吵。</w:t>
+              <w:t>半对。</w:t>
             </w:r>
           </w:p>
           <w:p>
@@ -14993,12 +13931,6 @@
               <w:right w:val="nil"/>
             </w:tcBorders>
             <w:vAlign w:val="center"/>
-            <w:tcMar>
-              <w:top w:w="120" w:type="dxa"/>
-              <w:left w:w="160" w:type="dxa"/>
-              <w:bottom w:w="120" w:type="dxa"/>
-              <w:right w:w="160" w:type="dxa"/>
-            </w:tcMar>
           </w:tcPr>
           <w:p>
             <w:pPr>
@@ -15029,7 +13961,7 @@
                 <w:color w:val="2C2416"/>
                 <w:sz w:val="32"/>
               </w:rPr>
-              <w:t>噪音会伪装成机会。</w:t>
+              <w:t>全错。但可爱。</w:t>
             </w:r>
           </w:p>
           <w:p>
@@ -15077,12 +14009,6 @@
               <w:right w:val="nil"/>
             </w:tcBorders>
             <w:vAlign w:val="center"/>
-            <w:tcMar>
-              <w:top w:w="120" w:type="dxa"/>
-              <w:left w:w="160" w:type="dxa"/>
-              <w:bottom w:w="120" w:type="dxa"/>
-              <w:right w:w="160" w:type="dxa"/>
-            </w:tcMar>
           </w:tcPr>
           <w:p>
             <w:pPr>
@@ -15113,7 +14039,7 @@
                 <w:color w:val="2C2416"/>
                 <w:sz w:val="32"/>
               </w:rPr>
-              <w:t>机会很少喊。</w:t>
+              <w:t>有新消息。别点。</w:t>
             </w:r>
           </w:p>
           <w:p>
@@ -15161,12 +14087,6 @@
               <w:right w:val="nil"/>
             </w:tcBorders>
             <w:vAlign w:val="center"/>
-            <w:tcMar>
-              <w:top w:w="120" w:type="dxa"/>
-              <w:left w:w="160" w:type="dxa"/>
-              <w:bottom w:w="120" w:type="dxa"/>
-              <w:right w:w="160" w:type="dxa"/>
-            </w:tcMar>
           </w:tcPr>
           <w:p>
             <w:pPr>
@@ -15197,7 +14117,7 @@
                 <w:color w:val="2C2416"/>
                 <w:sz w:val="32"/>
               </w:rPr>
-              <w:t>真正的机会，你往往嫌慢。</w:t>
+              <w:t>偷看一次。扣分。</w:t>
             </w:r>
           </w:p>
           <w:p>
@@ -15245,12 +14165,6 @@
               <w:right w:val="nil"/>
             </w:tcBorders>
             <w:vAlign w:val="center"/>
-            <w:tcMar>
-              <w:top w:w="120" w:type="dxa"/>
-              <w:left w:w="160" w:type="dxa"/>
-              <w:bottom w:w="120" w:type="dxa"/>
-              <w:right w:w="160" w:type="dxa"/>
-            </w:tcMar>
           </w:tcPr>
           <w:p>
             <w:pPr>
@@ -15281,7 +14195,7 @@
                 <w:color w:val="2C2416"/>
                 <w:sz w:val="32"/>
               </w:rPr>
-              <w:t>慢一点。</w:t>
+              <w:t>生活不看分时图。</w:t>
             </w:r>
           </w:p>
           <w:p>
@@ -15329,12 +14243,6 @@
               <w:right w:val="nil"/>
             </w:tcBorders>
             <w:vAlign w:val="center"/>
-            <w:tcMar>
-              <w:top w:w="120" w:type="dxa"/>
-              <w:left w:w="160" w:type="dxa"/>
-              <w:bottom w:w="120" w:type="dxa"/>
-              <w:right w:w="160" w:type="dxa"/>
-            </w:tcMar>
           </w:tcPr>
           <w:p>
             <w:pPr>
@@ -15365,7 +14273,7 @@
                 <w:color w:val="2C2416"/>
                 <w:sz w:val="32"/>
               </w:rPr>
-              <w:t>再慢一点。</w:t>
+              <w:t>分时图也不看你。</w:t>
             </w:r>
           </w:p>
           <w:p>
@@ -15413,12 +14321,6 @@
               <w:right w:val="nil"/>
             </w:tcBorders>
             <w:vAlign w:val="center"/>
-            <w:tcMar>
-              <w:top w:w="120" w:type="dxa"/>
-              <w:left w:w="160" w:type="dxa"/>
-              <w:bottom w:w="120" w:type="dxa"/>
-              <w:right w:w="160" w:type="dxa"/>
-            </w:tcMar>
           </w:tcPr>
           <w:p>
             <w:pPr>
@@ -15449,7 +14351,7 @@
                 <w:color w:val="2C2416"/>
                 <w:sz w:val="32"/>
               </w:rPr>
-              <w:t>慢，是你对不确定性的礼貌。</w:t>
+              <w:t>太阳不看盘。</w:t>
             </w:r>
           </w:p>
           <w:p>
@@ -15497,12 +14399,6 @@
               <w:right w:val="nil"/>
             </w:tcBorders>
             <w:vAlign w:val="center"/>
-            <w:tcMar>
-              <w:top w:w="120" w:type="dxa"/>
-              <w:left w:w="160" w:type="dxa"/>
-              <w:bottom w:w="120" w:type="dxa"/>
-              <w:right w:w="160" w:type="dxa"/>
-            </w:tcMar>
           </w:tcPr>
           <w:p>
             <w:pPr>
@@ -15533,7 +14429,7 @@
                 <w:color w:val="2C2416"/>
                 <w:sz w:val="32"/>
               </w:rPr>
-              <w:t>市场不欠你快速致富。</w:t>
+              <w:t>鼠标会自己点。别帮它。</w:t>
             </w:r>
           </w:p>
           <w:p>
@@ -15581,12 +14477,6 @@
               <w:right w:val="nil"/>
             </w:tcBorders>
             <w:vAlign w:val="center"/>
-            <w:tcMar>
-              <w:top w:w="120" w:type="dxa"/>
-              <w:left w:w="160" w:type="dxa"/>
-              <w:bottom w:w="120" w:type="dxa"/>
-              <w:right w:w="160" w:type="dxa"/>
-            </w:tcMar>
           </w:tcPr>
           <w:p>
             <w:pPr>
@@ -15617,7 +14507,7 @@
                 <w:color w:val="2C2416"/>
                 <w:sz w:val="32"/>
               </w:rPr>
-              <w:t>也不欠你公平。</w:t>
+              <w:t>付款前看看窗外。</w:t>
             </w:r>
           </w:p>
           <w:p>
@@ -15665,12 +14555,6 @@
               <w:right w:val="nil"/>
             </w:tcBorders>
             <w:vAlign w:val="center"/>
-            <w:tcMar>
-              <w:top w:w="120" w:type="dxa"/>
-              <w:left w:w="160" w:type="dxa"/>
-              <w:bottom w:w="120" w:type="dxa"/>
-              <w:right w:w="160" w:type="dxa"/>
-            </w:tcMar>
           </w:tcPr>
           <w:p>
             <w:pPr>
@@ -15701,7 +14585,7 @@
                 <w:color w:val="2C2416"/>
                 <w:sz w:val="32"/>
               </w:rPr>
-              <w:t>它只报价。</w:t>
+              <w:t>试用装。不是正装。</w:t>
             </w:r>
           </w:p>
           <w:p>
@@ -15749,12 +14633,6 @@
               <w:right w:val="nil"/>
             </w:tcBorders>
             <w:vAlign w:val="center"/>
-            <w:tcMar>
-              <w:top w:w="120" w:type="dxa"/>
-              <w:left w:w="160" w:type="dxa"/>
-              <w:bottom w:w="120" w:type="dxa"/>
-              <w:right w:w="160" w:type="dxa"/>
-            </w:tcMar>
           </w:tcPr>
           <w:p>
             <w:pPr>
@@ -15785,7 +14663,7 @@
                 <w:color w:val="2C2416"/>
                 <w:sz w:val="32"/>
               </w:rPr>
-              <w:t>报价不是评价。</w:t>
+              <w:t>满减达不到。很好。</w:t>
             </w:r>
           </w:p>
           <w:p>
@@ -15833,12 +14711,6 @@
               <w:right w:val="nil"/>
             </w:tcBorders>
             <w:vAlign w:val="center"/>
-            <w:tcMar>
-              <w:top w:w="120" w:type="dxa"/>
-              <w:left w:w="160" w:type="dxa"/>
-              <w:bottom w:w="120" w:type="dxa"/>
-              <w:right w:w="160" w:type="dxa"/>
-            </w:tcMar>
           </w:tcPr>
           <w:p>
             <w:pPr>
@@ -15869,7 +14741,7 @@
                 <w:color w:val="2C2416"/>
                 <w:sz w:val="32"/>
               </w:rPr>
-              <w:t>涨不是夸奖。跌不是羞辱。</w:t>
+              <w:t>退货窗口还开着。</w:t>
             </w:r>
           </w:p>
           <w:p>
@@ -15917,12 +14789,6 @@
               <w:right w:val="nil"/>
             </w:tcBorders>
             <w:vAlign w:val="center"/>
-            <w:tcMar>
-              <w:top w:w="120" w:type="dxa"/>
-              <w:left w:w="160" w:type="dxa"/>
-              <w:bottom w:w="120" w:type="dxa"/>
-              <w:right w:w="160" w:type="dxa"/>
-            </w:tcMar>
           </w:tcPr>
           <w:p>
             <w:pPr>
@@ -15953,7 +14819,7 @@
                 <w:color w:val="2C2416"/>
                 <w:sz w:val="32"/>
               </w:rPr>
-              <w:t>别把净值当自我。</w:t>
+              <w:t>先夹菜。</w:t>
             </w:r>
           </w:p>
           <w:p>
@@ -16001,12 +14867,6 @@
               <w:right w:val="nil"/>
             </w:tcBorders>
             <w:vAlign w:val="center"/>
-            <w:tcMar>
-              <w:top w:w="120" w:type="dxa"/>
-              <w:left w:w="160" w:type="dxa"/>
-              <w:bottom w:w="120" w:type="dxa"/>
-              <w:right w:w="160" w:type="dxa"/>
-            </w:tcMar>
           </w:tcPr>
           <w:p>
             <w:pPr>
@@ -16037,7 +14897,7 @@
                 <w:color w:val="2C2416"/>
                 <w:sz w:val="32"/>
               </w:rPr>
-              <w:t>你不是你的持仓。</w:t>
+              <w:t>信封是空的。</w:t>
             </w:r>
           </w:p>
           <w:p>
@@ -16085,12 +14945,6 @@
               <w:right w:val="nil"/>
             </w:tcBorders>
             <w:vAlign w:val="center"/>
-            <w:tcMar>
-              <w:top w:w="120" w:type="dxa"/>
-              <w:left w:w="160" w:type="dxa"/>
-              <w:bottom w:w="120" w:type="dxa"/>
-              <w:right w:w="160" w:type="dxa"/>
-            </w:tcMar>
           </w:tcPr>
           <w:p>
             <w:pPr>
@@ -16121,7 +14975,7 @@
                 <w:color w:val="2C2416"/>
                 <w:sz w:val="32"/>
               </w:rPr>
-              <w:t>持仓会换。你还在。</w:t>
+              <w:t>花该浇了。不是现在。</w:t>
             </w:r>
           </w:p>
           <w:p>
@@ -16169,12 +15023,6 @@
               <w:right w:val="nil"/>
             </w:tcBorders>
             <w:vAlign w:val="center"/>
-            <w:tcMar>
-              <w:top w:w="120" w:type="dxa"/>
-              <w:left w:w="160" w:type="dxa"/>
-              <w:bottom w:w="120" w:type="dxa"/>
-              <w:right w:w="160" w:type="dxa"/>
-            </w:tcMar>
           </w:tcPr>
           <w:p>
             <w:pPr>
@@ -16205,7 +15053,7 @@
                 <w:color w:val="2C2416"/>
                 <w:sz w:val="32"/>
               </w:rPr>
-              <w:t>把身份从盘面上拿回来。</w:t>
+              <w:t>少冰。问题也少冰。</w:t>
             </w:r>
           </w:p>
           <w:p>
@@ -16253,12 +15101,6 @@
               <w:right w:val="nil"/>
             </w:tcBorders>
             <w:vAlign w:val="center"/>
-            <w:tcMar>
-              <w:top w:w="120" w:type="dxa"/>
-              <w:left w:w="160" w:type="dxa"/>
-              <w:bottom w:w="120" w:type="dxa"/>
-              <w:right w:w="160" w:type="dxa"/>
-            </w:tcMar>
           </w:tcPr>
           <w:p>
             <w:pPr>
@@ -16289,7 +15131,7 @@
                 <w:color w:val="2C2416"/>
                 <w:sz w:val="32"/>
               </w:rPr>
-              <w:t>去散步。</w:t>
+              <w:t>飞行模式十分钟。</w:t>
             </w:r>
           </w:p>
           <w:p>
@@ -16337,12 +15179,6 @@
               <w:right w:val="nil"/>
             </w:tcBorders>
             <w:vAlign w:val="center"/>
-            <w:tcMar>
-              <w:top w:w="120" w:type="dxa"/>
-              <w:left w:w="160" w:type="dxa"/>
-              <w:bottom w:w="120" w:type="dxa"/>
-              <w:right w:w="160" w:type="dxa"/>
-            </w:tcMar>
           </w:tcPr>
           <w:p>
             <w:pPr>
@@ -16373,7 +15209,7 @@
                 <w:color w:val="2C2416"/>
                 <w:sz w:val="32"/>
               </w:rPr>
-              <w:t>明天开盘还在。</w:t>
+              <w:t>十分钟后你还爱它吗？</w:t>
             </w:r>
           </w:p>
           <w:p>
@@ -16421,12 +15257,6 @@
               <w:right w:val="nil"/>
             </w:tcBorders>
             <w:vAlign w:val="center"/>
-            <w:tcMar>
-              <w:top w:w="120" w:type="dxa"/>
-              <w:left w:w="160" w:type="dxa"/>
-              <w:bottom w:w="120" w:type="dxa"/>
-              <w:right w:w="160" w:type="dxa"/>
-            </w:tcMar>
           </w:tcPr>
           <w:p>
             <w:pPr>
@@ -16457,7 +15287,7 @@
                 <w:color w:val="2C2416"/>
                 <w:sz w:val="32"/>
               </w:rPr>
-              <w:t>今晚没有必须完成的交易。</w:t>
+              <w:t>不爱了。正好。</w:t>
             </w:r>
           </w:p>
           <w:p>
@@ -16505,12 +15335,6 @@
               <w:right w:val="nil"/>
             </w:tcBorders>
             <w:vAlign w:val="center"/>
-            <w:tcMar>
-              <w:top w:w="120" w:type="dxa"/>
-              <w:left w:w="160" w:type="dxa"/>
-              <w:bottom w:w="120" w:type="dxa"/>
-              <w:right w:w="160" w:type="dxa"/>
-            </w:tcMar>
           </w:tcPr>
           <w:p>
             <w:pPr>
@@ -16541,7 +15365,7 @@
                 <w:color w:val="2C2416"/>
                 <w:sz w:val="32"/>
               </w:rPr>
-              <w:t>把问题交给睡眠。</w:t>
+              <w:t>还爱。那就吃饭。</w:t>
             </w:r>
           </w:p>
           <w:p>
@@ -16589,12 +15413,6 @@
               <w:right w:val="nil"/>
             </w:tcBorders>
             <w:vAlign w:val="center"/>
-            <w:tcMar>
-              <w:top w:w="120" w:type="dxa"/>
-              <w:left w:w="160" w:type="dxa"/>
-              <w:bottom w:w="120" w:type="dxa"/>
-              <w:right w:w="160" w:type="dxa"/>
-            </w:tcMar>
           </w:tcPr>
           <w:p>
             <w:pPr>
@@ -16625,7 +15443,7 @@
                 <w:color w:val="2C2416"/>
                 <w:sz w:val="32"/>
               </w:rPr>
-              <w:t>A 股夜里不会跑掉。</w:t>
+              <w:t>这根影线是刘海。</w:t>
             </w:r>
           </w:p>
           <w:p>
@@ -16673,12 +15491,6 @@
               <w:right w:val="nil"/>
             </w:tcBorders>
             <w:vAlign w:val="center"/>
-            <w:tcMar>
-              <w:top w:w="120" w:type="dxa"/>
-              <w:left w:w="160" w:type="dxa"/>
-              <w:bottom w:w="120" w:type="dxa"/>
-              <w:right w:w="160" w:type="dxa"/>
-            </w:tcMar>
           </w:tcPr>
           <w:p>
             <w:pPr>
@@ -16709,7 +15521,7 @@
                 <w:color w:val="2C2416"/>
                 <w:sz w:val="32"/>
               </w:rPr>
-              <w:t>你跑得掉的，是情绪。</w:t>
+              <w:t>洗剪吹再看。</w:t>
             </w:r>
           </w:p>
           <w:p>
@@ -16757,12 +15569,6 @@
               <w:right w:val="nil"/>
             </w:tcBorders>
             <w:vAlign w:val="center"/>
-            <w:tcMar>
-              <w:top w:w="120" w:type="dxa"/>
-              <w:left w:w="160" w:type="dxa"/>
-              <w:bottom w:w="120" w:type="dxa"/>
-              <w:right w:w="160" w:type="dxa"/>
-            </w:tcMar>
           </w:tcPr>
           <w:p>
             <w:pPr>
@@ -16793,7 +15599,7 @@
                 <w:color w:val="2C2416"/>
                 <w:sz w:val="32"/>
               </w:rPr>
-              <w:t>一次只问一个问题。</w:t>
+              <w:t>坐过站了。</w:t>
             </w:r>
           </w:p>
           <w:p>
@@ -16841,12 +15647,6 @@
               <w:right w:val="nil"/>
             </w:tcBorders>
             <w:vAlign w:val="center"/>
-            <w:tcMar>
-              <w:top w:w="120" w:type="dxa"/>
-              <w:left w:w="160" w:type="dxa"/>
-              <w:bottom w:w="120" w:type="dxa"/>
-              <w:right w:w="160" w:type="dxa"/>
-            </w:tcMar>
           </w:tcPr>
           <w:p>
             <w:pPr>
@@ -16877,7 +15677,7 @@
                 <w:color w:val="2C2416"/>
                 <w:sz w:val="32"/>
               </w:rPr>
-              <w:t>问得太大。拆小。</w:t>
+              <w:t>堵车时别换道。</w:t>
             </w:r>
           </w:p>
           <w:p>
@@ -16925,12 +15725,6 @@
               <w:right w:val="nil"/>
             </w:tcBorders>
             <w:vAlign w:val="center"/>
-            <w:tcMar>
-              <w:top w:w="120" w:type="dxa"/>
-              <w:left w:w="160" w:type="dxa"/>
-              <w:bottom w:w="120" w:type="dxa"/>
-              <w:right w:w="160" w:type="dxa"/>
-            </w:tcMar>
           </w:tcPr>
           <w:p>
             <w:pPr>
@@ -16961,7 +15755,7 @@
                 <w:color w:val="2C2416"/>
                 <w:sz w:val="32"/>
               </w:rPr>
-              <w:t>重新问。</w:t>
+              <w:t>系统繁忙。</w:t>
             </w:r>
           </w:p>
           <w:p>
@@ -17009,12 +15803,6 @@
               <w:right w:val="nil"/>
             </w:tcBorders>
             <w:vAlign w:val="center"/>
-            <w:tcMar>
-              <w:top w:w="120" w:type="dxa"/>
-              <w:left w:w="160" w:type="dxa"/>
-              <w:bottom w:w="120" w:type="dxa"/>
-              <w:right w:w="160" w:type="dxa"/>
-            </w:tcMar>
           </w:tcPr>
           <w:p>
             <w:pPr>
@@ -17045,7 +15833,7 @@
                 <w:color w:val="2C2416"/>
                 <w:sz w:val="32"/>
               </w:rPr>
-              <w:t>绝对不行。</w:t>
+              <w:t>没有就是没有。</w:t>
             </w:r>
           </w:p>
           <w:p>
@@ -17093,12 +15881,6 @@
               <w:right w:val="nil"/>
             </w:tcBorders>
             <w:vAlign w:val="center"/>
-            <w:tcMar>
-              <w:top w:w="120" w:type="dxa"/>
-              <w:left w:w="160" w:type="dxa"/>
-              <w:bottom w:w="120" w:type="dxa"/>
-              <w:right w:w="160" w:type="dxa"/>
-            </w:tcMar>
           </w:tcPr>
           <w:p>
             <w:pPr>
@@ -17129,7 +15911,7 @@
                 <w:color w:val="2C2416"/>
                 <w:sz w:val="32"/>
               </w:rPr>
-              <w:t>暂缓。</w:t>
+              <w:t>答案打瞌睡。</w:t>
             </w:r>
           </w:p>
           <w:p>
@@ -17177,12 +15959,6 @@
               <w:right w:val="nil"/>
             </w:tcBorders>
             <w:vAlign w:val="center"/>
-            <w:tcMar>
-              <w:top w:w="120" w:type="dxa"/>
-              <w:left w:w="160" w:type="dxa"/>
-              <w:bottom w:w="120" w:type="dxa"/>
-              <w:right w:w="160" w:type="dxa"/>
-            </w:tcMar>
           </w:tcPr>
           <w:p>
             <w:pPr>
@@ -17213,7 +15989,7 @@
                 <w:color w:val="2C2416"/>
                 <w:sz w:val="32"/>
               </w:rPr>
-              <w:t>别用生活费。</w:t>
+              <w:t>梦到也不算数。</w:t>
             </w:r>
           </w:p>
           <w:p>
@@ -17261,12 +16037,6 @@
               <w:right w:val="nil"/>
             </w:tcBorders>
             <w:vAlign w:val="center"/>
-            <w:tcMar>
-              <w:top w:w="120" w:type="dxa"/>
-              <w:left w:w="160" w:type="dxa"/>
-              <w:bottom w:w="120" w:type="dxa"/>
-              <w:right w:w="160" w:type="dxa"/>
-            </w:tcMar>
           </w:tcPr>
           <w:p>
             <w:pPr>
@@ -17297,7 +16067,7 @@
                 <w:color w:val="2C2416"/>
                 <w:sz w:val="32"/>
               </w:rPr>
-              <w:t>这是生活费。放下。</w:t>
+              <w:t>硬刚今晚不营业。</w:t>
             </w:r>
           </w:p>
           <w:p>
@@ -17345,12 +16115,6 @@
               <w:right w:val="nil"/>
             </w:tcBorders>
             <w:vAlign w:val="center"/>
-            <w:tcMar>
-              <w:top w:w="120" w:type="dxa"/>
-              <w:left w:w="160" w:type="dxa"/>
-              <w:bottom w:w="120" w:type="dxa"/>
-              <w:right w:w="160" w:type="dxa"/>
-            </w:tcMar>
           </w:tcPr>
           <w:p>
             <w:pPr>
@@ -17381,7 +16145,7 @@
                 <w:color w:val="2C2416"/>
                 <w:sz w:val="32"/>
               </w:rPr>
-              <w:t>家人比账户重要。</w:t>
+              <w:t>今晚不营业。</w:t>
             </w:r>
           </w:p>
           <w:p>
@@ -17429,12 +16193,6 @@
               <w:right w:val="nil"/>
             </w:tcBorders>
             <w:vAlign w:val="center"/>
-            <w:tcMar>
-              <w:top w:w="120" w:type="dxa"/>
-              <w:left w:w="160" w:type="dxa"/>
-              <w:bottom w:w="120" w:type="dxa"/>
-              <w:right w:w="160" w:type="dxa"/>
-            </w:tcMar>
           </w:tcPr>
           <w:p>
             <w:pPr>
@@ -17465,7 +16223,7 @@
                 <w:color w:val="2C2416"/>
                 <w:sz w:val="32"/>
               </w:rPr>
-              <w:t>不要向市场证明你是对的。</w:t>
+              <w:t>挺好。去晒太阳。</w:t>
             </w:r>
           </w:p>
           <w:p>
@@ -17513,12 +16271,6 @@
               <w:right w:val="nil"/>
             </w:tcBorders>
             <w:vAlign w:val="center"/>
-            <w:tcMar>
-              <w:top w:w="120" w:type="dxa"/>
-              <w:left w:w="160" w:type="dxa"/>
-              <w:bottom w:w="120" w:type="dxa"/>
-              <w:right w:w="160" w:type="dxa"/>
-            </w:tcMar>
           </w:tcPr>
           <w:p>
             <w:pPr>
@@ -17549,7 +16301,7 @@
                 <w:color w:val="2C2416"/>
                 <w:sz w:val="32"/>
               </w:rPr>
-              <w:t>估值低，也可以更低。</w:t>
+              <w:t>标签还在。先剪。</w:t>
             </w:r>
           </w:p>
           <w:p>
@@ -17597,12 +16349,6 @@
               <w:right w:val="nil"/>
             </w:tcBorders>
             <w:vAlign w:val="center"/>
-            <w:tcMar>
-              <w:top w:w="120" w:type="dxa"/>
-              <w:left w:w="160" w:type="dxa"/>
-              <w:bottom w:w="120" w:type="dxa"/>
-              <w:right w:w="160" w:type="dxa"/>
-            </w:tcMar>
           </w:tcPr>
           <w:p>
             <w:pPr>
@@ -17633,7 +16379,7 @@
                 <w:color w:val="2C2416"/>
                 <w:sz w:val="32"/>
               </w:rPr>
-              <w:t>估值高，也可以更高。</w:t>
+              <w:t>Ctrl+Z 对行情无效。</w:t>
             </w:r>
           </w:p>
           <w:p>
@@ -17681,12 +16427,6 @@
               <w:right w:val="nil"/>
             </w:tcBorders>
             <w:vAlign w:val="center"/>
-            <w:tcMar>
-              <w:top w:w="120" w:type="dxa"/>
-              <w:left w:w="160" w:type="dxa"/>
-              <w:bottom w:w="120" w:type="dxa"/>
-              <w:right w:w="160" w:type="dxa"/>
-            </w:tcMar>
           </w:tcPr>
           <w:p>
             <w:pPr>
@@ -17717,7 +16457,7 @@
                 <w:color w:val="2C2416"/>
                 <w:sz w:val="32"/>
               </w:rPr>
-              <w:t>便宜不是理由。贵也不是。</w:t>
+              <w:t>对方正在输入。永远。</w:t>
             </w:r>
           </w:p>
           <w:p>
@@ -17765,12 +16505,6 @@
               <w:right w:val="nil"/>
             </w:tcBorders>
             <w:vAlign w:val="center"/>
-            <w:tcMar>
-              <w:top w:w="120" w:type="dxa"/>
-              <w:left w:w="160" w:type="dxa"/>
-              <w:bottom w:w="120" w:type="dxa"/>
-              <w:right w:w="160" w:type="dxa"/>
-            </w:tcMar>
           </w:tcPr>
           <w:p>
             <w:pPr>
@@ -17801,7 +16535,7 @@
                 <w:color w:val="2C2416"/>
                 <w:sz w:val="32"/>
               </w:rPr>
-              <w:t>你不必每个热点都在。</w:t>
+              <w:t>鞋带开了。</w:t>
             </w:r>
           </w:p>
           <w:p>
@@ -17849,12 +16583,6 @@
               <w:right w:val="nil"/>
             </w:tcBorders>
             <w:vAlign w:val="center"/>
-            <w:tcMar>
-              <w:top w:w="120" w:type="dxa"/>
-              <w:left w:w="160" w:type="dxa"/>
-              <w:bottom w:w="120" w:type="dxa"/>
-              <w:right w:w="160" w:type="dxa"/>
-            </w:tcMar>
           </w:tcPr>
           <w:p>
             <w:pPr>
@@ -17885,7 +16613,7 @@
                 <w:color w:val="2C2416"/>
                 <w:sz w:val="32"/>
               </w:rPr>
-              <w:t>涨停不是邀请函。</w:t>
+              <w:t>盐少许。</w:t>
             </w:r>
           </w:p>
           <w:p>
@@ -17933,12 +16661,6 @@
               <w:right w:val="nil"/>
             </w:tcBorders>
             <w:vAlign w:val="center"/>
-            <w:tcMar>
-              <w:top w:w="120" w:type="dxa"/>
-              <w:left w:w="160" w:type="dxa"/>
-              <w:bottom w:w="120" w:type="dxa"/>
-              <w:right w:w="160" w:type="dxa"/>
-            </w:tcMar>
           </w:tcPr>
           <w:p>
             <w:pPr>
@@ -17969,7 +16691,7 @@
                 <w:color w:val="2C2416"/>
                 <w:sz w:val="32"/>
               </w:rPr>
-              <w:t>跌停不是末日。也不是便宜。</w:t>
+              <w:t>汤还烫。</w:t>
             </w:r>
           </w:p>
           <w:p>
@@ -18017,12 +16739,6 @@
               <w:right w:val="nil"/>
             </w:tcBorders>
             <w:vAlign w:val="center"/>
-            <w:tcMar>
-              <w:top w:w="120" w:type="dxa"/>
-              <w:left w:w="160" w:type="dxa"/>
-              <w:bottom w:w="120" w:type="dxa"/>
-              <w:right w:w="160" w:type="dxa"/>
-            </w:tcMar>
           </w:tcPr>
           <w:p>
             <w:pPr>
@@ -18053,7 +16769,7 @@
                 <w:color w:val="2C2416"/>
                 <w:sz w:val="32"/>
               </w:rPr>
-              <w:t>尾盘的冲动，留给明天。</w:t>
+              <w:t>电梯音乐很难听。</w:t>
             </w:r>
           </w:p>
           <w:p>
@@ -18101,12 +16817,6 @@
               <w:right w:val="nil"/>
             </w:tcBorders>
             <w:vAlign w:val="center"/>
-            <w:tcMar>
-              <w:top w:w="120" w:type="dxa"/>
-              <w:left w:w="160" w:type="dxa"/>
-              <w:bottom w:w="120" w:type="dxa"/>
-              <w:right w:w="160" w:type="dxa"/>
-            </w:tcMar>
           </w:tcPr>
           <w:p>
             <w:pPr>
@@ -18137,7 +16847,7 @@
                 <w:color w:val="2C2416"/>
                 <w:sz w:val="32"/>
               </w:rPr>
-              <w:t>日历不是策略。</w:t>
+              <w:t>密码输错三次。</w:t>
             </w:r>
           </w:p>
           <w:p>
@@ -18185,12 +16895,6 @@
               <w:right w:val="nil"/>
             </w:tcBorders>
             <w:vAlign w:val="center"/>
-            <w:tcMar>
-              <w:top w:w="120" w:type="dxa"/>
-              <w:left w:w="160" w:type="dxa"/>
-              <w:bottom w:w="120" w:type="dxa"/>
-              <w:right w:w="160" w:type="dxa"/>
-            </w:tcMar>
           </w:tcPr>
           <w:p>
             <w:pPr>
@@ -18221,7 +16925,7 @@
                 <w:color w:val="2C2416"/>
                 <w:sz w:val="32"/>
               </w:rPr>
-              <w:t>龙虎榜不是神谕。</w:t>
+              <w:t>这件不合适。</w:t>
             </w:r>
           </w:p>
           <w:p>
@@ -18269,12 +16973,6 @@
               <w:right w:val="nil"/>
             </w:tcBorders>
             <w:vAlign w:val="center"/>
-            <w:tcMar>
-              <w:top w:w="120" w:type="dxa"/>
-              <w:left w:w="160" w:type="dxa"/>
-              <w:bottom w:w="120" w:type="dxa"/>
-              <w:right w:w="160" w:type="dxa"/>
-            </w:tcMar>
           </w:tcPr>
           <w:p>
             <w:pPr>
@@ -18305,7 +17003,7 @@
                 <w:color w:val="2C2416"/>
                 <w:sz w:val="32"/>
               </w:rPr>
-              <w:t>北向不是神。</w:t>
+              <w:t>镜子起雾了。</w:t>
             </w:r>
           </w:p>
           <w:p>
@@ -18353,12 +17051,6 @@
               <w:right w:val="nil"/>
             </w:tcBorders>
             <w:vAlign w:val="center"/>
-            <w:tcMar>
-              <w:top w:w="120" w:type="dxa"/>
-              <w:left w:w="160" w:type="dxa"/>
-              <w:bottom w:w="120" w:type="dxa"/>
-              <w:right w:w="160" w:type="dxa"/>
-            </w:tcMar>
           </w:tcPr>
           <w:p>
             <w:pPr>
@@ -18389,7 +17081,7 @@
                 <w:color w:val="2C2416"/>
                 <w:sz w:val="32"/>
               </w:rPr>
-              <w:t>牛市里你会觉得自己是天才。</w:t>
+              <w:t>伞借给别人了。</w:t>
             </w:r>
           </w:p>
           <w:p>
@@ -18437,12 +17129,6 @@
               <w:right w:val="nil"/>
             </w:tcBorders>
             <w:vAlign w:val="center"/>
-            <w:tcMar>
-              <w:top w:w="120" w:type="dxa"/>
-              <w:left w:w="160" w:type="dxa"/>
-              <w:bottom w:w="120" w:type="dxa"/>
-              <w:right w:w="160" w:type="dxa"/>
-            </w:tcMar>
           </w:tcPr>
           <w:p>
             <w:pPr>
@@ -18473,7 +17159,7 @@
                 <w:color w:val="2C2416"/>
                 <w:sz w:val="32"/>
               </w:rPr>
-              <w:t>熊市里你会觉得世界欺骗你。</w:t>
+              <w:t>片尾曲开始了。</w:t>
             </w:r>
           </w:p>
           <w:p>
@@ -18521,12 +17207,6 @@
               <w:right w:val="nil"/>
             </w:tcBorders>
             <w:vAlign w:val="center"/>
-            <w:tcMar>
-              <w:top w:w="120" w:type="dxa"/>
-              <w:left w:w="160" w:type="dxa"/>
-              <w:bottom w:w="120" w:type="dxa"/>
-              <w:right w:w="160" w:type="dxa"/>
-            </w:tcMar>
           </w:tcPr>
           <w:p>
             <w:pPr>
@@ -18557,7 +17237,7 @@
                 <w:color w:val="2C2416"/>
                 <w:sz w:val="32"/>
               </w:rPr>
-              <w:t>两者都不是事实。</w:t>
+              <w:t>彩蛋没有。</w:t>
             </w:r>
           </w:p>
           <w:p>
@@ -18605,12 +17285,6 @@
               <w:right w:val="nil"/>
             </w:tcBorders>
             <w:vAlign w:val="center"/>
-            <w:tcMar>
-              <w:top w:w="120" w:type="dxa"/>
-              <w:left w:w="160" w:type="dxa"/>
-              <w:bottom w:w="120" w:type="dxa"/>
-              <w:right w:w="160" w:type="dxa"/>
-            </w:tcMar>
           </w:tcPr>
           <w:p>
             <w:pPr>
@@ -18641,7 +17315,7 @@
                 <w:color w:val="2C2416"/>
                 <w:sz w:val="32"/>
               </w:rPr>
-              <w:t>领会，比答案更重要。</w:t>
+              <w:t>续集别看。</w:t>
             </w:r>
           </w:p>
           <w:p>
@@ -18689,12 +17363,6 @@
               <w:right w:val="nil"/>
             </w:tcBorders>
             <w:vAlign w:val="center"/>
-            <w:tcMar>
-              <w:top w:w="120" w:type="dxa"/>
-              <w:left w:w="160" w:type="dxa"/>
-              <w:bottom w:w="120" w:type="dxa"/>
-              <w:right w:w="160" w:type="dxa"/>
-            </w:tcMar>
           </w:tcPr>
           <w:p>
             <w:pPr>
@@ -18725,7 +17393,7 @@
                 <w:color w:val="2C2416"/>
                 <w:sz w:val="32"/>
               </w:rPr>
-              <w:t>不要连翻。</w:t>
+              <w:t>主角不是你。</w:t>
             </w:r>
           </w:p>
           <w:p>
@@ -18752,12 +17420,6 @@
       <w:pgMar w:top="680" w:right="680" w:bottom="680" w:left="680" w:header="720" w:footer="720" w:gutter="0"/>
       <w:cols w:space="720"/>
       <w:docGrid w:linePitch="360"/>
-      <w:pgBorders w:offsetFrom="page">
-        <w:top w:val="none" w:sz="0" w:space="0" w:color="auto"/>
-        <w:left w:val="none" w:sz="0" w:space="0" w:color="auto"/>
-        <w:bottom w:val="none" w:sz="0" w:space="0" w:color="auto"/>
-        <w:right w:val="none" w:sz="0" w:space="0" w:color="auto"/>
-      </w:pgBorders>
     </w:sectPr>
   </w:body>
 </w:document>

</xml_diff>